<commit_message>
update GEDAI manual + correct tooltips
I have check the tooltip and corrected for all the module.
</commit_message>
<xml_diff>
--- a/Manuels/Manuel_GEDAI_module.docx
+++ b/Manuels/Manuel_GEDAI_module.docx
@@ -9,6 +9,7 @@
           <w:lang w:val="en-US"/>
         </w:rPr>
       </w:pPr>
+      <w:proofErr w:type="spellStart"/>
       <w:r>
         <w:rPr>
           <w:sz w:val="32"/>
@@ -17,6 +18,7 @@
         </w:rPr>
         <w:t>EEGpal</w:t>
       </w:r>
+      <w:proofErr w:type="spellEnd"/>
       <w:r>
         <w:rPr>
           <w:lang w:val="en-US"/>
@@ -80,7 +82,7 @@
           <w:rFonts w:ascii="Calibri" w:hAnsi="Calibri" w:cs="Calibri"/>
           <w:lang w:val="en-US"/>
         </w:rPr>
-        <w:t>XX</w:t>
+        <w:t>03</w:t>
       </w:r>
       <w:r>
         <w:rPr>
@@ -94,7 +96,7 @@
           <w:rFonts w:ascii="Calibri" w:hAnsi="Calibri" w:cs="Calibri"/>
           <w:lang w:val="en-US"/>
         </w:rPr>
-        <w:t>XX</w:t>
+        <w:t>01</w:t>
       </w:r>
       <w:r>
         <w:rPr>
@@ -108,7 +110,7 @@
           <w:rFonts w:ascii="Calibri" w:hAnsi="Calibri" w:cs="Calibri"/>
           <w:lang w:val="en-US"/>
         </w:rPr>
-        <w:t>5</w:t>
+        <w:t>6</w:t>
       </w:r>
     </w:p>
     <w:p>
@@ -155,7 +157,88 @@
           <w:rFonts w:ascii="Calibri" w:hAnsi="Calibri" w:cs="Calibri"/>
           <w:lang w:val="en-US"/>
         </w:rPr>
-        <w:t>The GEDAI toolbox is a new way to correct EEG artefacts (muscles, eyes, electronic noise, etc..)</w:t>
+        <w:t xml:space="preserve">The GEDAI toolbox </w:t>
+      </w:r>
+      <w:r>
+        <w:rPr>
+          <w:rFonts w:ascii="Calibri" w:hAnsi="Calibri" w:cs="Calibri"/>
+          <w:lang w:val="en-US"/>
+        </w:rPr>
+        <w:t>(</w:t>
+      </w:r>
+      <w:r>
+        <w:rPr>
+          <w:rFonts w:ascii="Calibri" w:hAnsi="Calibri" w:cs="Calibri"/>
+          <w:lang w:val="en-US"/>
+        </w:rPr>
+        <w:t>Generalized Eigenvalue De-</w:t>
+      </w:r>
+      <w:proofErr w:type="spellStart"/>
+      <w:r>
+        <w:rPr>
+          <w:rFonts w:ascii="Calibri" w:hAnsi="Calibri" w:cs="Calibri"/>
+          <w:lang w:val="en-US"/>
+        </w:rPr>
+        <w:t>Artifacting</w:t>
+      </w:r>
+      <w:proofErr w:type="spellEnd"/>
+      <w:r>
+        <w:rPr>
+          <w:rFonts w:ascii="Calibri" w:hAnsi="Calibri" w:cs="Calibri"/>
+          <w:lang w:val="en-US"/>
+        </w:rPr>
+        <w:t xml:space="preserve"> Instrument</w:t>
+      </w:r>
+      <w:r>
+        <w:rPr>
+          <w:rFonts w:ascii="Calibri" w:hAnsi="Calibri" w:cs="Calibri"/>
+          <w:lang w:val="en-US"/>
+        </w:rPr>
+        <w:t>)</w:t>
+      </w:r>
+      <w:r>
+        <w:rPr>
+          <w:rFonts w:ascii="Calibri" w:hAnsi="Calibri" w:cs="Calibri"/>
+          <w:lang w:val="en-US"/>
+        </w:rPr>
+        <w:t xml:space="preserve"> </w:t>
+      </w:r>
+      <w:r>
+        <w:rPr>
+          <w:rFonts w:ascii="Calibri" w:hAnsi="Calibri" w:cs="Calibri"/>
+          <w:lang w:val="en-US"/>
+        </w:rPr>
+        <w:t xml:space="preserve">offers a new approach to correcting EEG artefacts caused by muscles, eyes, electronic noise, </w:t>
+      </w:r>
+      <w:proofErr w:type="spellStart"/>
+      <w:r>
+        <w:rPr>
+          <w:rFonts w:ascii="Calibri" w:hAnsi="Calibri" w:cs="Calibri"/>
+          <w:lang w:val="en-US"/>
+        </w:rPr>
+        <w:t>etc</w:t>
+      </w:r>
+      <w:proofErr w:type="spellEnd"/>
+      <w:r>
+        <w:rPr>
+          <w:rFonts w:ascii="Calibri" w:hAnsi="Calibri" w:cs="Calibri"/>
+          <w:lang w:val="en-US"/>
+        </w:rPr>
+        <w:t xml:space="preserve"> with a </w:t>
+      </w:r>
+      <w:r>
+        <w:rPr>
+          <w:rFonts w:ascii="Calibri" w:hAnsi="Calibri" w:cs="Calibri"/>
+          <w:lang w:val="en-US"/>
+        </w:rPr>
+        <w:t>fully automated</w:t>
+      </w:r>
+      <w:r>
+        <w:rPr>
+          <w:rFonts w:ascii="Calibri" w:hAnsi="Calibri" w:cs="Calibri"/>
+          <w:lang w:val="en-US"/>
+        </w:rPr>
+        <w:t xml:space="preserve"> strategy that does not require any human supervision or clean data samples</w:t>
       </w:r>
       <w:r>
         <w:rPr>
@@ -169,151 +252,35 @@
           <w:rFonts w:ascii="Calibri" w:hAnsi="Calibri" w:cs="Calibri"/>
           <w:lang w:val="en-US"/>
         </w:rPr>
+        <w:br/>
+      </w:r>
+      <w:r>
+        <w:rPr>
+          <w:rFonts w:ascii="Calibri" w:hAnsi="Calibri" w:cs="Calibri"/>
+          <w:lang w:val="en-US"/>
+        </w:rPr>
+        <w:t xml:space="preserve">Based on prior knowledge of the brain’s 'signal' subspace (i.e. its spatial covariance), the authors computed a matrix that corresponds to the theoretical EEG signal if all cortical sources were active simultaneously. This matrix is computed based solely on the spatial distribution of the electrodes (synthetic signal), and is therefore completely free from artefacts. The GEDAI toolbox then uses generalized eigenvalue decomposition (GEVD) to compare your real data with this theoretical perfect signal. This allows you to effectively separate source components belonging to the artefact subspace from those belonging to the brain subspace. The result is a new version of your EEG signal containing only the most probable brain signal (without artefact). This provides better results </w:t>
+      </w:r>
+      <w:r>
+        <w:rPr>
+          <w:rFonts w:ascii="Calibri" w:hAnsi="Calibri" w:cs="Calibri"/>
+          <w:lang w:val="en-US"/>
+        </w:rPr>
+        <w:t xml:space="preserve">and faster processing </w:t>
+      </w:r>
+      <w:r>
+        <w:rPr>
+          <w:rFonts w:ascii="Calibri" w:hAnsi="Calibri" w:cs="Calibri"/>
+          <w:lang w:val="en-US"/>
+        </w:rPr>
+        <w:t>than ICA or ASR strategies (which should not be applied in addition to GEDAI correction).</w:t>
+      </w:r>
+      <w:r>
+        <w:rPr>
+          <w:rFonts w:ascii="Calibri" w:hAnsi="Calibri" w:cs="Calibri"/>
+          <w:lang w:val="en-US"/>
+        </w:rPr>
         <w:t xml:space="preserve"> </w:t>
-      </w:r>
-      <w:r>
-        <w:rPr>
-          <w:rFonts w:ascii="Calibri" w:hAnsi="Calibri" w:cs="Calibri"/>
-          <w:lang w:val="en-US"/>
-        </w:rPr>
-        <w:t xml:space="preserve"> </w:t>
-      </w:r>
-      <w:r>
-        <w:rPr>
-          <w:rFonts w:ascii="Calibri" w:hAnsi="Calibri" w:cs="Calibri"/>
-          <w:highlight w:val="yellow"/>
-          <w:lang w:val="en-US"/>
-        </w:rPr>
-        <w:t xml:space="preserve">ecrir un phase de résumé. </w:t>
-      </w:r>
-      <w:r>
-        <w:rPr>
-          <w:rFonts w:ascii="Calibri" w:hAnsi="Calibri" w:cs="Calibri"/>
-          <w:highlight w:val="yellow"/>
-          <w:lang w:val="en-US"/>
-        </w:rPr>
-        <w:t>based on the comparison of your data with a</w:t>
-      </w:r>
-      <w:r>
-        <w:rPr>
-          <w:rFonts w:ascii="Calibri" w:hAnsi="Calibri" w:cs="Calibri"/>
-          <w:highlight w:val="yellow"/>
-          <w:lang w:val="en-US"/>
-        </w:rPr>
-        <w:t xml:space="preserve"> matrix of </w:t>
-      </w:r>
-      <w:r>
-        <w:rPr>
-          <w:rFonts w:ascii="Calibri" w:hAnsi="Calibri" w:cs="Calibri"/>
-          <w:highlight w:val="yellow"/>
-          <w:lang w:val="en-US"/>
-        </w:rPr>
-        <w:t>.</w:t>
-      </w:r>
-      <w:r>
-        <w:rPr>
-          <w:rFonts w:ascii="Calibri" w:hAnsi="Calibri" w:cs="Calibri"/>
-          <w:lang w:val="en-US"/>
-        </w:rPr>
-        <w:t xml:space="preserve"> </w:t>
-      </w:r>
-    </w:p>
-    <w:p>
-      <w:pPr>
-        <w:rPr>
-          <w:rFonts w:ascii="Calibri" w:hAnsi="Calibri" w:cs="Calibri"/>
-          <w:lang w:val="en-US"/>
-        </w:rPr>
-      </w:pPr>
-      <w:r>
-        <w:rPr>
-          <w:rFonts w:ascii="Calibri" w:hAnsi="Calibri" w:cs="Calibri"/>
-          <w:lang w:val="en-US"/>
-        </w:rPr>
-        <w:t xml:space="preserve">This matrix corresponds to the </w:t>
-      </w:r>
-      <w:r>
-        <w:rPr>
-          <w:rFonts w:ascii="Calibri" w:hAnsi="Calibri" w:cs="Calibri"/>
-          <w:lang w:val="en-US"/>
-        </w:rPr>
-        <w:t xml:space="preserve">theorical EEG signal if all cortical sources were active at the same time. It is compute only based on the spatial distribution of the electrodes (synthetic signal) and not from real data. </w:t>
-      </w:r>
-    </w:p>
-    <w:p>
-      <w:pPr>
-        <w:rPr>
-          <w:rFonts w:ascii="Calibri" w:hAnsi="Calibri" w:cs="Calibri"/>
-          <w:lang w:val="en-US"/>
-        </w:rPr>
-      </w:pPr>
-    </w:p>
-    <w:p>
-      <w:pPr>
-        <w:rPr>
-          <w:rFonts w:ascii="Calibri" w:hAnsi="Calibri" w:cs="Calibri"/>
-          <w:lang w:val="en-US"/>
-        </w:rPr>
-      </w:pPr>
-      <w:r>
-        <w:rPr>
-          <w:rFonts w:ascii="Calibri" w:hAnsi="Calibri" w:cs="Calibri"/>
-          <w:lang w:val="en-US"/>
-        </w:rPr>
-        <w:t xml:space="preserve">It replaces ICA or ASR and </w:t>
-      </w:r>
-      <w:r>
-        <w:rPr>
-          <w:rFonts w:ascii="Calibri" w:hAnsi="Calibri" w:cs="Calibri"/>
-          <w:color w:val="EE0000"/>
-          <w:lang w:val="en-US"/>
-        </w:rPr>
-        <w:t>should not be applied in addition to them</w:t>
-      </w:r>
-      <w:r>
-        <w:rPr>
-          <w:rFonts w:ascii="Calibri" w:hAnsi="Calibri" w:cs="Calibri"/>
-          <w:lang w:val="en-US"/>
-        </w:rPr>
-        <w:t xml:space="preserve">. </w:t>
-      </w:r>
-    </w:p>
-    <w:p>
-      <w:pPr>
-        <w:rPr>
-          <w:rFonts w:ascii="Calibri" w:hAnsi="Calibri" w:cs="Calibri"/>
-          <w:lang w:val="en-US"/>
-        </w:rPr>
-      </w:pPr>
-      <w:r>
-        <w:rPr>
-          <w:rFonts w:ascii="Calibri" w:hAnsi="Calibri" w:cs="Calibri"/>
-          <w:lang w:val="en-US"/>
-        </w:rPr>
-        <w:t>M</w:t>
-      </w:r>
-      <w:r>
-        <w:rPr>
-          <w:rFonts w:ascii="Calibri" w:hAnsi="Calibri" w:cs="Calibri"/>
-          <w:lang w:val="en-US"/>
-        </w:rPr>
-        <w:t xml:space="preserve">ulti-channel EEG may be considered to be a linear summation of electrical activities from a brain “signal” subspace with one containing different types of non-cerebral noise or “artifact”. This mixture may be “unmixed” by linear decomposition techniques (e.g. PCA or ICA) into separate components with individual source locations (“topographies”) and respective time-courses (“waveforms”). However, as "blind" source separation methods, PCA and ICA leverage statistical properties within mixed data to recover underlying sources, functioning without </w:t>
-      </w:r>
-      <w:r>
-        <w:rPr>
-          <w:rFonts w:ascii="Calibri" w:hAnsi="Calibri" w:cs="Calibri"/>
-          <w:i/>
-          <w:iCs/>
-          <w:lang w:val="en-US"/>
-        </w:rPr>
-        <w:t xml:space="preserve">a priori </w:t>
-      </w:r>
-      <w:r>
-        <w:rPr>
-          <w:rFonts w:ascii="Calibri" w:hAnsi="Calibri" w:cs="Calibri"/>
-          <w:lang w:val="en-US"/>
-        </w:rPr>
-        <w:t>knowledge of the original signals or their mixing process. GEDAI combines prior knowledge of the brain’s “signal” subspace (i.e. its spatial covariance) with generalized eigenvalue decomposition (GEVD) to more effectively separate source components belonging to the artifact-subspace from those of the brain-subspace.</w:t>
       </w:r>
     </w:p>
     <w:p>
@@ -367,7 +334,55 @@
           <w:rFonts w:ascii="Calibri" w:hAnsi="Calibri" w:cs="Calibri"/>
           <w:lang w:val="en-US"/>
         </w:rPr>
-        <w:t xml:space="preserve">Ros, T., Férat, V., Huang, Y., et al. (2025). Return of the GEDAI: Unsupervised EEG Denoising based on Leadfield Filtering. bioRxiv. </w:t>
+        <w:t xml:space="preserve">Ros, T., </w:t>
+      </w:r>
+      <w:proofErr w:type="spellStart"/>
+      <w:r>
+        <w:rPr>
+          <w:rFonts w:ascii="Calibri" w:hAnsi="Calibri" w:cs="Calibri"/>
+          <w:lang w:val="en-US"/>
+        </w:rPr>
+        <w:t>Férat</w:t>
+      </w:r>
+      <w:proofErr w:type="spellEnd"/>
+      <w:r>
+        <w:rPr>
+          <w:rFonts w:ascii="Calibri" w:hAnsi="Calibri" w:cs="Calibri"/>
+          <w:lang w:val="en-US"/>
+        </w:rPr>
+        <w:t xml:space="preserve">, V., Huang, Y., et al. (2025). Return of the GEDAI: Unsupervised EEG Denoising based on </w:t>
+      </w:r>
+      <w:proofErr w:type="spellStart"/>
+      <w:r>
+        <w:rPr>
+          <w:rFonts w:ascii="Calibri" w:hAnsi="Calibri" w:cs="Calibri"/>
+          <w:lang w:val="en-US"/>
+        </w:rPr>
+        <w:t>Leadfield</w:t>
+      </w:r>
+      <w:proofErr w:type="spellEnd"/>
+      <w:r>
+        <w:rPr>
+          <w:rFonts w:ascii="Calibri" w:hAnsi="Calibri" w:cs="Calibri"/>
+          <w:lang w:val="en-US"/>
+        </w:rPr>
+        <w:t xml:space="preserve"> Filtering. </w:t>
+      </w:r>
+      <w:proofErr w:type="spellStart"/>
+      <w:r>
+        <w:rPr>
+          <w:rFonts w:ascii="Calibri" w:hAnsi="Calibri" w:cs="Calibri"/>
+          <w:lang w:val="en-US"/>
+        </w:rPr>
+        <w:t>bioRxiv</w:t>
+      </w:r>
+      <w:proofErr w:type="spellEnd"/>
+      <w:r>
+        <w:rPr>
+          <w:rFonts w:ascii="Calibri" w:hAnsi="Calibri" w:cs="Calibri"/>
+          <w:lang w:val="en-US"/>
+        </w:rPr>
+        <w:t xml:space="preserve">. </w:t>
       </w:r>
       <w:hyperlink r:id="rId8" w:tgtFrame="_blank" w:history="1">
         <w:r>
@@ -398,9 +413,9 @@
       <w:r>
         <w:rPr>
           <w:rFonts w:ascii="Calibri" w:hAnsi="Calibri" w:cs="Calibri"/>
-          <w:lang w:val="en-US"/>
-        </w:rPr>
-        <w:lastRenderedPageBreak/>
+          <w:noProof/>
+          <w:lang w:val="en-US"/>
+        </w:rPr>
         <w:drawing>
           <wp:inline distT="0" distB="0" distL="0" distR="0" wp14:anchorId="6408F368" wp14:editId="7751BA22">
             <wp:extent cx="4292930" cy="2832141"/>
@@ -445,6 +460,21 @@
           <w:lang w:val="en-US"/>
         </w:rPr>
       </w:pPr>
+      <w:r>
+        <w:rPr>
+          <w:rFonts w:ascii="Calibri" w:hAnsi="Calibri" w:cs="Calibri"/>
+          <w:lang w:val="en-US"/>
+        </w:rPr>
+        <w:br w:type="page"/>
+      </w:r>
+    </w:p>
+    <w:p>
+      <w:pPr>
+        <w:rPr>
+          <w:rFonts w:ascii="Calibri" w:hAnsi="Calibri" w:cs="Calibri"/>
+          <w:lang w:val="en-US"/>
+        </w:rPr>
+      </w:pPr>
     </w:p>
     <w:p>
       <w:pPr>
@@ -485,14 +515,23 @@
           <w:rFonts w:ascii="Calibri" w:hAnsi="Calibri" w:cs="Calibri"/>
           <w:lang w:val="en-US"/>
         </w:rPr>
-        <w:t>D</w:t>
-      </w:r>
-      <w:r>
-        <w:rPr>
-          <w:rFonts w:ascii="Calibri" w:hAnsi="Calibri" w:cs="Calibri"/>
-          <w:lang w:val="en-US"/>
-        </w:rPr>
-        <w:t xml:space="preserve">etermining deartifacting strength. </w:t>
+        <w:t xml:space="preserve">Determining </w:t>
+      </w:r>
+      <w:proofErr w:type="spellStart"/>
+      <w:r>
+        <w:rPr>
+          <w:rFonts w:ascii="Calibri" w:hAnsi="Calibri" w:cs="Calibri"/>
+          <w:lang w:val="en-US"/>
+        </w:rPr>
+        <w:t>deartifacting</w:t>
+      </w:r>
+      <w:proofErr w:type="spellEnd"/>
+      <w:r>
+        <w:rPr>
+          <w:rFonts w:ascii="Calibri" w:hAnsi="Calibri" w:cs="Calibri"/>
+          <w:lang w:val="en-US"/>
+        </w:rPr>
+        <w:t xml:space="preserve"> strength. </w:t>
       </w:r>
       <w:r>
         <w:rPr>
@@ -542,14 +581,7 @@
           <w:rFonts w:ascii="Calibri" w:hAnsi="Calibri" w:cs="Calibri"/>
           <w:lang w:val="en-US"/>
         </w:rPr>
-        <w:t xml:space="preserve"> : Default option:</w:t>
-      </w:r>
-      <w:r>
-        <w:rPr>
-          <w:rFonts w:ascii="Calibri" w:hAnsi="Calibri" w:cs="Calibri"/>
-          <w:lang w:val="en-US"/>
-        </w:rPr>
-        <w:t xml:space="preserve"> </w:t>
+        <w:t xml:space="preserve"> : Default option: </w:t>
       </w:r>
     </w:p>
     <w:p>
@@ -627,7 +659,23 @@
           <w:rFonts w:ascii="Calibri" w:hAnsi="Calibri" w:cs="Calibri"/>
           <w:lang w:val="en-US"/>
         </w:rPr>
-        <w:t>The leadfield matrix corresponds to the matrix of the theoretical clean EEG signal used as a reference. This matrix has been pre-computed based on a configuration of 343 electrodes (10-5 layout). The toolbox needs to interpolate it to match the electrode configuration of your data using a spherical algorithm.</w:t>
+        <w:t xml:space="preserve">The </w:t>
+      </w:r>
+      <w:proofErr w:type="spellStart"/>
+      <w:r>
+        <w:rPr>
+          <w:rFonts w:ascii="Calibri" w:hAnsi="Calibri" w:cs="Calibri"/>
+          <w:lang w:val="en-US"/>
+        </w:rPr>
+        <w:t>leadfield</w:t>
+      </w:r>
+      <w:proofErr w:type="spellEnd"/>
+      <w:r>
+        <w:rPr>
+          <w:rFonts w:ascii="Calibri" w:hAnsi="Calibri" w:cs="Calibri"/>
+          <w:lang w:val="en-US"/>
+        </w:rPr>
+        <w:t xml:space="preserve"> matrix corresponds to the matrix of the theoretical clean EEG signal used as a reference. This matrix has been pre-computed based on a configuration of 343 electrodes (10-5 layout). The toolbox needs to interpolate it to match the electrode configuration of your data using a spherical algorithm.</w:t>
       </w:r>
       <w:r>
         <w:rPr>
@@ -682,7 +730,39 @@
           <w:rFonts w:ascii="Calibri" w:hAnsi="Calibri" w:cs="Calibri"/>
           <w:lang w:val="en-US"/>
         </w:rPr>
-        <w:t xml:space="preserve"> (main EEGpal window) respect the international convention (e.g. Fp1, Cz, …)</w:t>
+        <w:t xml:space="preserve"> (main </w:t>
+      </w:r>
+      <w:proofErr w:type="spellStart"/>
+      <w:r>
+        <w:rPr>
+          <w:rFonts w:ascii="Calibri" w:hAnsi="Calibri" w:cs="Calibri"/>
+          <w:lang w:val="en-US"/>
+        </w:rPr>
+        <w:t>EEGpal</w:t>
+      </w:r>
+      <w:proofErr w:type="spellEnd"/>
+      <w:r>
+        <w:rPr>
+          <w:rFonts w:ascii="Calibri" w:hAnsi="Calibri" w:cs="Calibri"/>
+          <w:lang w:val="en-US"/>
+        </w:rPr>
+        <w:t xml:space="preserve"> window) respect the international convention (e.g. Fp1, </w:t>
+      </w:r>
+      <w:proofErr w:type="spellStart"/>
+      <w:r>
+        <w:rPr>
+          <w:rFonts w:ascii="Calibri" w:hAnsi="Calibri" w:cs="Calibri"/>
+          <w:lang w:val="en-US"/>
+        </w:rPr>
+        <w:t>Cz</w:t>
+      </w:r>
+      <w:proofErr w:type="spellEnd"/>
+      <w:r>
+        <w:rPr>
+          <w:rFonts w:ascii="Calibri" w:hAnsi="Calibri" w:cs="Calibri"/>
+          <w:lang w:val="en-US"/>
+        </w:rPr>
+        <w:t>, …)</w:t>
       </w:r>
       <w:r>
         <w:rPr>
@@ -730,7 +810,14 @@
           <w:rFonts w:ascii="Calibri" w:hAnsi="Calibri" w:cs="Calibri"/>
           <w:lang w:val="en-US"/>
         </w:rPr>
-        <w:t>wavelet band. Default is 12.</w:t>
+        <w:t>wavelet band. Default is 12</w:t>
+      </w:r>
+      <w:r>
+        <w:rPr>
+          <w:rFonts w:ascii="Calibri" w:hAnsi="Calibri" w:cs="Calibri"/>
+          <w:lang w:val="en-US"/>
+        </w:rPr>
+        <w:t xml:space="preserve"> which is a good compromise (see FAQ for more explanation of this parameter)</w:t>
       </w:r>
     </w:p>
     <w:p>
@@ -757,7 +844,7 @@
           <w:rFonts w:ascii="Calibri" w:hAnsi="Calibri" w:cs="Calibri"/>
           <w:lang w:val="en-US"/>
         </w:rPr>
-        <w:t xml:space="preserve"> to use only if no filter has been applied to your data</w:t>
+        <w:t xml:space="preserve"> to use if no filter has been applied to your data</w:t>
       </w:r>
       <w:r>
         <w:rPr>
@@ -798,7 +885,14 @@
           <w:rFonts w:ascii="Calibri" w:hAnsi="Calibri" w:cs="Calibri"/>
           <w:lang w:val="en-US"/>
         </w:rPr>
-        <w:t>This option allows you to remove part of the signal rather than denoise it. Epochs are rejected based on Explained Noise Variance (ENOVA). Specifying a threshold of 0.9 will reject all epochs in which more than 90% of the signal is identified as noise. A smaller value will lead to more conservative processing. The toolbox will automatically adjust the position of EEG events recorded in MRK files.</w:t>
+        <w:t xml:space="preserve">This option allows you to remove part of the signal rather than denoise it. Epochs are rejected based on Explained Noise Variance (ENOVA). </w:t>
+      </w:r>
+      <w:r>
+        <w:rPr>
+          <w:rFonts w:ascii="Calibri" w:hAnsi="Calibri" w:cs="Calibri"/>
+          <w:lang w:val="en-US"/>
+        </w:rPr>
+        <w:t>Setting the threshold to 0.9 will result in the rejection of all epochs in which more than 90% of the signal is identified as noise. A smaller value will lead to more conservative processing. The toolbox automatically adjusts the position of EEG events recorded in MRK files.</w:t>
       </w:r>
       <w:r>
         <w:rPr>
@@ -806,6 +900,122 @@
           <w:lang w:val="en-US"/>
         </w:rPr>
         <w:t xml:space="preserve">  </w:t>
+      </w:r>
+      <w:r>
+        <w:rPr>
+          <w:rFonts w:ascii="Calibri" w:hAnsi="Calibri" w:cs="Calibri"/>
+          <w:lang w:val="en-US"/>
+        </w:rPr>
+        <w:br/>
+      </w:r>
+      <w:r>
+        <w:rPr>
+          <w:rFonts w:ascii="Calibri" w:hAnsi="Calibri" w:cs="Calibri"/>
+          <w:b/>
+          <w:bCs/>
+          <w:color w:val="EE0000"/>
+          <w:lang w:val="en-US"/>
+        </w:rPr>
+        <w:t>This option is NOT RECOMMENDED for an ERP study!</w:t>
+      </w:r>
+      <w:r>
+        <w:rPr>
+          <w:rFonts w:ascii="Calibri" w:hAnsi="Calibri" w:cs="Calibri"/>
+          <w:lang w:val="en-US"/>
+        </w:rPr>
+        <w:t xml:space="preserve"> </w:t>
+      </w:r>
+      <w:r>
+        <w:rPr>
+          <w:rFonts w:ascii="Calibri" w:hAnsi="Calibri" w:cs="Calibri"/>
+          <w:lang w:val="en-US"/>
+        </w:rPr>
+        <w:t xml:space="preserve">Indeed, the epochs used by GEDAI (typically 1 s) are independent of the </w:t>
+      </w:r>
+      <w:r>
+        <w:rPr>
+          <w:rFonts w:ascii="Calibri" w:hAnsi="Calibri" w:cs="Calibri"/>
+          <w:lang w:val="en-US"/>
+        </w:rPr>
+        <w:t>events (triggers/</w:t>
+      </w:r>
+      <w:r>
+        <w:rPr>
+          <w:rFonts w:ascii="Calibri" w:hAnsi="Calibri" w:cs="Calibri"/>
+          <w:lang w:val="en-US"/>
+        </w:rPr>
+        <w:t>markers</w:t>
+      </w:r>
+      <w:r>
+        <w:rPr>
+          <w:rFonts w:ascii="Calibri" w:hAnsi="Calibri" w:cs="Calibri"/>
+          <w:lang w:val="en-US"/>
+        </w:rPr>
+        <w:t>)</w:t>
+      </w:r>
+      <w:r>
+        <w:rPr>
+          <w:rFonts w:ascii="Calibri" w:hAnsi="Calibri" w:cs="Calibri"/>
+          <w:lang w:val="en-US"/>
+        </w:rPr>
+        <w:t xml:space="preserve"> in the file. This means that epochs </w:t>
+      </w:r>
+      <w:proofErr w:type="spellStart"/>
+      <w:r>
+        <w:rPr>
+          <w:rFonts w:ascii="Calibri" w:hAnsi="Calibri" w:cs="Calibri"/>
+          <w:lang w:val="en-US"/>
+        </w:rPr>
+        <w:t>centred</w:t>
+      </w:r>
+      <w:proofErr w:type="spellEnd"/>
+      <w:r>
+        <w:rPr>
+          <w:rFonts w:ascii="Calibri" w:hAnsi="Calibri" w:cs="Calibri"/>
+          <w:lang w:val="en-US"/>
+        </w:rPr>
+        <w:t xml:space="preserve"> on events (triggers/markers) used for averaging could be truncated. This is why using this option for an ERP study is strongly not recommended, and the artefact rejection options in the </w:t>
+      </w:r>
+      <w:proofErr w:type="spellStart"/>
+      <w:r>
+        <w:rPr>
+          <w:rFonts w:ascii="Calibri" w:hAnsi="Calibri" w:cs="Calibri"/>
+          <w:i/>
+          <w:iCs/>
+          <w:lang w:val="en-US"/>
+        </w:rPr>
+        <w:t>Epoching</w:t>
+      </w:r>
+      <w:proofErr w:type="spellEnd"/>
+      <w:r>
+        <w:rPr>
+          <w:rFonts w:ascii="Calibri" w:hAnsi="Calibri" w:cs="Calibri"/>
+          <w:i/>
+          <w:iCs/>
+          <w:lang w:val="en-US"/>
+        </w:rPr>
+        <w:t xml:space="preserve"> module</w:t>
+      </w:r>
+      <w:r>
+        <w:rPr>
+          <w:rFonts w:ascii="Calibri" w:hAnsi="Calibri" w:cs="Calibri"/>
+          <w:lang w:val="en-US"/>
+        </w:rPr>
+        <w:t xml:space="preserve"> should be used instead. </w:t>
+      </w:r>
+      <w:r>
+        <w:rPr>
+          <w:rFonts w:ascii="Calibri" w:hAnsi="Calibri" w:cs="Calibri"/>
+          <w:lang w:val="en-US"/>
+        </w:rPr>
+        <w:t xml:space="preserve">Keep this option for resting state recording. </w:t>
+      </w:r>
+      <w:r>
+        <w:rPr>
+          <w:rFonts w:ascii="Calibri" w:hAnsi="Calibri" w:cs="Calibri"/>
+          <w:lang w:val="en-US"/>
+        </w:rPr>
+        <w:t xml:space="preserve"> </w:t>
       </w:r>
     </w:p>
     <w:p>
@@ -841,7 +1051,23 @@
           <w:rFonts w:ascii="Calibri" w:hAnsi="Calibri" w:cs="Calibri"/>
           <w:lang w:val="en-US"/>
         </w:rPr>
-        <w:t xml:space="preserve"> from MathWorks installed in your Matlab.</w:t>
+        <w:t xml:space="preserve"> from MathWorks installed in your </w:t>
+      </w:r>
+      <w:proofErr w:type="spellStart"/>
+      <w:r>
+        <w:rPr>
+          <w:rFonts w:ascii="Calibri" w:hAnsi="Calibri" w:cs="Calibri"/>
+          <w:lang w:val="en-US"/>
+        </w:rPr>
+        <w:t>Matlab</w:t>
+      </w:r>
+      <w:proofErr w:type="spellEnd"/>
+      <w:r>
+        <w:rPr>
+          <w:rFonts w:ascii="Calibri" w:hAnsi="Calibri" w:cs="Calibri"/>
+          <w:lang w:val="en-US"/>
+        </w:rPr>
+        <w:t>.</w:t>
       </w:r>
     </w:p>
     <w:p>
@@ -861,22 +1087,35 @@
           <w:rFonts w:ascii="Calibri" w:hAnsi="Calibri" w:cs="Calibri"/>
           <w:lang w:val="en-US"/>
         </w:rPr>
-        <w:t>Open an additional window overlaying the original and corrected signals for visualisation.</w:t>
-      </w:r>
-    </w:p>
-    <w:p>
-      <w:pPr>
-        <w:rPr>
-          <w:rFonts w:ascii="Calibri" w:hAnsi="Calibri" w:cs="Calibri"/>
-          <w:lang w:val="en-US"/>
-        </w:rPr>
-      </w:pPr>
-      <w:r>
-        <w:rPr>
-          <w:rFonts w:ascii="Calibri" w:hAnsi="Calibri" w:cs="Calibri"/>
-          <w:lang w:val="en-US"/>
-        </w:rPr>
-        <w:lastRenderedPageBreak/>
+        <w:t xml:space="preserve">Open an additional window overlaying the original and corrected signals for </w:t>
+      </w:r>
+      <w:r>
+        <w:rPr>
+          <w:rFonts w:ascii="Calibri" w:hAnsi="Calibri" w:cs="Calibri"/>
+          <w:lang w:val="en-US"/>
+        </w:rPr>
+        <w:t>visualization</w:t>
+      </w:r>
+      <w:r>
+        <w:rPr>
+          <w:rFonts w:ascii="Calibri" w:hAnsi="Calibri" w:cs="Calibri"/>
+          <w:lang w:val="en-US"/>
+        </w:rPr>
+        <w:t>.</w:t>
+      </w:r>
+    </w:p>
+    <w:p>
+      <w:pPr>
+        <w:rPr>
+          <w:rFonts w:ascii="Calibri" w:hAnsi="Calibri" w:cs="Calibri"/>
+          <w:lang w:val="en-US"/>
+        </w:rPr>
+      </w:pPr>
+      <w:r>
+        <w:rPr>
+          <w:rFonts w:ascii="Calibri" w:hAnsi="Calibri" w:cs="Calibri"/>
+          <w:lang w:val="en-US"/>
+        </w:rPr>
         <w:t>Pannel B</w:t>
       </w:r>
       <w:r>
@@ -1028,21 +1267,7 @@
           <w:rFonts w:ascii="Calibri" w:hAnsi="Calibri" w:cs="Calibri"/>
           <w:lang w:val="en-US"/>
         </w:rPr>
-        <w:t xml:space="preserve"> will carry out the processing parameterized in the </w:t>
-      </w:r>
-      <w:r>
-        <w:rPr>
-          <w:rFonts w:ascii="Calibri" w:hAnsi="Calibri" w:cs="Calibri"/>
-          <w:lang w:val="en-US"/>
-        </w:rPr>
-        <w:t>Re-referencing</w:t>
-      </w:r>
-      <w:r>
-        <w:rPr>
-          <w:rFonts w:ascii="Calibri" w:hAnsi="Calibri" w:cs="Calibri"/>
-          <w:lang w:val="en-US"/>
-        </w:rPr>
-        <w:t xml:space="preserve"> module.</w:t>
+        <w:t xml:space="preserve"> will carry out the processing.</w:t>
       </w:r>
       <w:r>
         <w:rPr>
@@ -1069,6 +1294,7 @@
           <w:rFonts w:ascii="Calibri" w:hAnsi="Calibri" w:cs="Calibri"/>
           <w:lang w:val="en-US"/>
         </w:rPr>
+        <w:lastRenderedPageBreak/>
         <w:t xml:space="preserve">The </w:t>
       </w:r>
       <w:r>
@@ -1099,7 +1325,7 @@
           <w:rFonts w:ascii="Calibri" w:hAnsi="Calibri" w:cs="Calibri"/>
           <w:lang w:val="en-US"/>
         </w:rPr>
-        <w:t>Re-Referencing</w:t>
+        <w:t>GEDAI</w:t>
       </w:r>
       <w:r>
         <w:rPr>
@@ -1114,6 +1340,13 @@
           <w:lang w:val="en-US"/>
         </w:rPr>
         <w:t xml:space="preserve">. </w:t>
+      </w:r>
+      <w:r>
+        <w:rPr>
+          <w:rFonts w:ascii="Calibri" w:hAnsi="Calibri" w:cs="Calibri"/>
+          <w:lang w:val="en-US"/>
+        </w:rPr>
+        <w:t>This is a useful option if you want to integrate GEDAI processing into a batch job.</w:t>
       </w:r>
     </w:p>
     <w:p>
@@ -1156,7 +1389,7 @@
           <w:rFonts w:ascii="Calibri" w:hAnsi="Calibri" w:cs="Calibri"/>
           <w:lang w:val="en-US"/>
         </w:rPr>
-        <w:t>Re-Referencing</w:t>
+        <w:t>GEDAI</w:t>
       </w:r>
       <w:r>
         <w:rPr>
@@ -1165,6 +1398,14 @@
         </w:rPr>
         <w:t xml:space="preserve"> module window.</w:t>
       </w:r>
+    </w:p>
+    <w:p>
+      <w:pPr>
+        <w:rPr>
+          <w:rFonts w:ascii="Calibri" w:hAnsi="Calibri" w:cs="Calibri"/>
+          <w:lang w:val="en-US"/>
+        </w:rPr>
+      </w:pPr>
     </w:p>
     <w:p>
       <w:pPr>
@@ -1242,7 +1483,23 @@
           <w:rFonts w:ascii="Calibri" w:hAnsi="Calibri" w:cs="Calibri"/>
           <w:lang w:val="en-US"/>
         </w:rPr>
-        <w:t>In GEDAI, EEG data are not analyzed as one long continuous signal. Instead, the data are segmented into short epochs, and these epochs are used to compute frequency-specific covariance matrices that feed the GED (Generalized EigenDecomposition).</w:t>
+        <w:t xml:space="preserve">In GEDAI, EEG data are not analyzed as one long continuous signal. Instead, the data are segmented into short epochs, and these epochs are used to compute frequency-specific covariance matrices that feed the GED (Generalized </w:t>
+      </w:r>
+      <w:proofErr w:type="spellStart"/>
+      <w:r>
+        <w:rPr>
+          <w:rFonts w:ascii="Calibri" w:hAnsi="Calibri" w:cs="Calibri"/>
+          <w:lang w:val="en-US"/>
+        </w:rPr>
+        <w:t>EigenDecomposition</w:t>
+      </w:r>
+      <w:proofErr w:type="spellEnd"/>
+      <w:r>
+        <w:rPr>
+          <w:rFonts w:ascii="Calibri" w:hAnsi="Calibri" w:cs="Calibri"/>
+          <w:lang w:val="en-US"/>
+        </w:rPr>
+        <w:t>).</w:t>
       </w:r>
     </w:p>
     <w:p>
@@ -1366,6 +1623,9 @@
             </m:den>
           </m:f>
           <m:r>
+            <m:rPr>
+              <m:sty m:val="p"/>
+            </m:rPr>
             <w:rPr>
               <w:rFonts w:ascii="Calibri" w:hAnsi="Calibri" w:cs="Calibri"/>
               <w:lang w:val="en-US"/>
@@ -1381,11 +1641,19 @@
           <w:rFonts w:ascii="Calibri" w:hAnsi="Calibri" w:cs="Calibri"/>
         </w:rPr>
       </w:pPr>
-      <w:r>
-        <w:rPr>
-          <w:rFonts w:ascii="Calibri" w:hAnsi="Calibri" w:cs="Calibri"/>
-        </w:rPr>
-        <w:t>With the default value:</w:t>
+      <w:proofErr w:type="spellStart"/>
+      <w:r>
+        <w:rPr>
+          <w:rFonts w:ascii="Calibri" w:hAnsi="Calibri" w:cs="Calibri"/>
+        </w:rPr>
+        <w:t>With</w:t>
+      </w:r>
+      <w:proofErr w:type="spellEnd"/>
+      <w:r>
+        <w:rPr>
+          <w:rFonts w:ascii="Calibri" w:hAnsi="Calibri" w:cs="Calibri"/>
+        </w:rPr>
+        <w:t xml:space="preserve"> the default value:</w:t>
       </w:r>
     </w:p>
     <w:p>
@@ -1398,24 +1666,54 @@
           <w:rFonts w:ascii="Calibri" w:hAnsi="Calibri" w:cs="Calibri"/>
         </w:rPr>
       </w:pPr>
-      <w:r>
-        <w:rPr>
-          <w:rFonts w:ascii="Calibri" w:hAnsi="Calibri" w:cs="Calibri"/>
-        </w:rPr>
-        <w:t>Epochs size (wave cycles) = 12</w:t>
-      </w:r>
-    </w:p>
-    <w:p>
-      <w:pPr>
-        <w:rPr>
-          <w:rFonts w:ascii="Calibri" w:hAnsi="Calibri" w:cs="Calibri"/>
-        </w:rPr>
-      </w:pPr>
-      <w:r>
-        <w:rPr>
-          <w:rFonts w:ascii="Calibri" w:hAnsi="Calibri" w:cs="Calibri"/>
-        </w:rPr>
-        <w:t>Examples:</w:t>
+      <w:proofErr w:type="spellStart"/>
+      <w:r>
+        <w:rPr>
+          <w:rFonts w:ascii="Calibri" w:hAnsi="Calibri" w:cs="Calibri"/>
+        </w:rPr>
+        <w:t>Epochs</w:t>
+      </w:r>
+      <w:proofErr w:type="spellEnd"/>
+      <w:r>
+        <w:rPr>
+          <w:rFonts w:ascii="Calibri" w:hAnsi="Calibri" w:cs="Calibri"/>
+        </w:rPr>
+        <w:t xml:space="preserve"> size (</w:t>
+      </w:r>
+      <w:proofErr w:type="spellStart"/>
+      <w:r>
+        <w:rPr>
+          <w:rFonts w:ascii="Calibri" w:hAnsi="Calibri" w:cs="Calibri"/>
+        </w:rPr>
+        <w:t>wave</w:t>
+      </w:r>
+      <w:proofErr w:type="spellEnd"/>
+      <w:r>
+        <w:rPr>
+          <w:rFonts w:ascii="Calibri" w:hAnsi="Calibri" w:cs="Calibri"/>
+        </w:rPr>
+        <w:t xml:space="preserve"> cycles) = 12</w:t>
+      </w:r>
+    </w:p>
+    <w:p>
+      <w:pPr>
+        <w:rPr>
+          <w:rFonts w:ascii="Calibri" w:hAnsi="Calibri" w:cs="Calibri"/>
+        </w:rPr>
+      </w:pPr>
+      <w:proofErr w:type="spellStart"/>
+      <w:r>
+        <w:rPr>
+          <w:rFonts w:ascii="Calibri" w:hAnsi="Calibri" w:cs="Calibri"/>
+        </w:rPr>
+        <w:t>Examples</w:t>
+      </w:r>
+      <w:proofErr w:type="spellEnd"/>
+      <w:r>
+        <w:rPr>
+          <w:rFonts w:ascii="Calibri" w:hAnsi="Calibri" w:cs="Calibri"/>
+        </w:rPr>
+        <w:t>:</w:t>
       </w:r>
     </w:p>
     <w:p>
@@ -1432,7 +1730,21 @@
         <w:rPr>
           <w:rFonts w:ascii="Calibri" w:hAnsi="Calibri" w:cs="Calibri"/>
         </w:rPr>
-        <w:t>At 10 Hz → epoch ≈ 1.2 s</w:t>
+        <w:t xml:space="preserve">At 10 Hz → </w:t>
+      </w:r>
+      <w:proofErr w:type="spellStart"/>
+      <w:r>
+        <w:rPr>
+          <w:rFonts w:ascii="Calibri" w:hAnsi="Calibri" w:cs="Calibri"/>
+        </w:rPr>
+        <w:t>epoch</w:t>
+      </w:r>
+      <w:proofErr w:type="spellEnd"/>
+      <w:r>
+        <w:rPr>
+          <w:rFonts w:ascii="Calibri" w:hAnsi="Calibri" w:cs="Calibri"/>
+        </w:rPr>
+        <w:t xml:space="preserve"> ≈ 1.2 s</w:t>
       </w:r>
     </w:p>
     <w:p>
@@ -1449,7 +1761,21 @@
         <w:rPr>
           <w:rFonts w:ascii="Calibri" w:hAnsi="Calibri" w:cs="Calibri"/>
         </w:rPr>
-        <w:t>At 5 Hz → epoch ≈ 2.4 s</w:t>
+        <w:t xml:space="preserve">At 5 Hz → </w:t>
+      </w:r>
+      <w:proofErr w:type="spellStart"/>
+      <w:r>
+        <w:rPr>
+          <w:rFonts w:ascii="Calibri" w:hAnsi="Calibri" w:cs="Calibri"/>
+        </w:rPr>
+        <w:t>epoch</w:t>
+      </w:r>
+      <w:proofErr w:type="spellEnd"/>
+      <w:r>
+        <w:rPr>
+          <w:rFonts w:ascii="Calibri" w:hAnsi="Calibri" w:cs="Calibri"/>
+        </w:rPr>
+        <w:t xml:space="preserve"> ≈ 2.4 s</w:t>
       </w:r>
     </w:p>
     <w:p>
@@ -1466,7 +1792,21 @@
         <w:rPr>
           <w:rFonts w:ascii="Calibri" w:hAnsi="Calibri" w:cs="Calibri"/>
         </w:rPr>
-        <w:t>At 30 Hz → epoch ≈ 0.4 s</w:t>
+        <w:t xml:space="preserve">At 30 Hz → </w:t>
+      </w:r>
+      <w:proofErr w:type="spellStart"/>
+      <w:r>
+        <w:rPr>
+          <w:rFonts w:ascii="Calibri" w:hAnsi="Calibri" w:cs="Calibri"/>
+        </w:rPr>
+        <w:t>epoch</w:t>
+      </w:r>
+      <w:proofErr w:type="spellEnd"/>
+      <w:r>
+        <w:rPr>
+          <w:rFonts w:ascii="Calibri" w:hAnsi="Calibri" w:cs="Calibri"/>
+        </w:rPr>
+        <w:t xml:space="preserve"> ≈ 0.4 s</w:t>
       </w:r>
     </w:p>
     <w:p>
@@ -1496,7 +1836,21 @@
         <w:rPr>
           <w:rFonts w:ascii="Calibri" w:hAnsi="Calibri" w:cs="Calibri"/>
         </w:rPr>
-        <w:t>Band-limited covariance matrices</w:t>
+        <w:t>Band-</w:t>
+      </w:r>
+      <w:proofErr w:type="spellStart"/>
+      <w:r>
+        <w:rPr>
+          <w:rFonts w:ascii="Calibri" w:hAnsi="Calibri" w:cs="Calibri"/>
+        </w:rPr>
+        <w:t>limited</w:t>
+      </w:r>
+      <w:proofErr w:type="spellEnd"/>
+      <w:r>
+        <w:rPr>
+          <w:rFonts w:ascii="Calibri" w:hAnsi="Calibri" w:cs="Calibri"/>
+        </w:rPr>
+        <w:t xml:space="preserve"> covariance matrices</w:t>
       </w:r>
     </w:p>
     <w:p>
@@ -1509,12 +1863,28 @@
           <w:rFonts w:ascii="Calibri" w:hAnsi="Calibri" w:cs="Calibri"/>
         </w:rPr>
       </w:pPr>
-      <w:r>
-        <w:rPr>
-          <w:rFonts w:ascii="Calibri" w:hAnsi="Calibri" w:cs="Calibri"/>
-        </w:rPr>
-        <w:t>Wavelet-based spectral filtering</w:t>
-      </w:r>
+      <w:proofErr w:type="spellStart"/>
+      <w:r>
+        <w:rPr>
+          <w:rFonts w:ascii="Calibri" w:hAnsi="Calibri" w:cs="Calibri"/>
+        </w:rPr>
+        <w:t>Wavelet-based</w:t>
+      </w:r>
+      <w:proofErr w:type="spellEnd"/>
+      <w:r>
+        <w:rPr>
+          <w:rFonts w:ascii="Calibri" w:hAnsi="Calibri" w:cs="Calibri"/>
+        </w:rPr>
+        <w:t xml:space="preserve"> spectral </w:t>
+      </w:r>
+      <w:proofErr w:type="spellStart"/>
+      <w:r>
+        <w:rPr>
+          <w:rFonts w:ascii="Calibri" w:hAnsi="Calibri" w:cs="Calibri"/>
+        </w:rPr>
+        <w:t>filtering</w:t>
+      </w:r>
+      <w:proofErr w:type="spellEnd"/>
     </w:p>
     <w:p>
       <w:pPr>
@@ -1564,9 +1934,16 @@
         <w:rPr>
           <w:rFonts w:ascii="Calibri" w:hAnsi="Calibri" w:cs="Calibri"/>
         </w:rPr>
-        <w:lastRenderedPageBreak/>
-        <w:t>Covariance estimation quality</w:t>
-      </w:r>
+        <w:t xml:space="preserve">Covariance estimation </w:t>
+      </w:r>
+      <w:proofErr w:type="spellStart"/>
+      <w:r>
+        <w:rPr>
+          <w:rFonts w:ascii="Calibri" w:hAnsi="Calibri" w:cs="Calibri"/>
+        </w:rPr>
+        <w:t>quality</w:t>
+      </w:r>
+      <w:proofErr w:type="spellEnd"/>
     </w:p>
     <w:p>
       <w:pPr>
@@ -1620,7 +1997,35 @@
         <w:rPr>
           <w:rFonts w:ascii="Calibri" w:hAnsi="Calibri" w:cs="Calibri"/>
         </w:rPr>
-        <w:t>Time–frequency trade-off</w:t>
+        <w:t>Time–</w:t>
+      </w:r>
+      <w:proofErr w:type="spellStart"/>
+      <w:r>
+        <w:rPr>
+          <w:rFonts w:ascii="Calibri" w:hAnsi="Calibri" w:cs="Calibri"/>
+        </w:rPr>
+        <w:t>frequency</w:t>
+      </w:r>
+      <w:proofErr w:type="spellEnd"/>
+      <w:r>
+        <w:rPr>
+          <w:rFonts w:ascii="Calibri" w:hAnsi="Calibri" w:cs="Calibri"/>
+        </w:rPr>
+        <w:t xml:space="preserve"> </w:t>
+      </w:r>
+      <w:proofErr w:type="spellStart"/>
+      <w:r>
+        <w:rPr>
+          <w:rFonts w:ascii="Calibri" w:hAnsi="Calibri" w:cs="Calibri"/>
+        </w:rPr>
+        <w:t>trade</w:t>
+      </w:r>
+      <w:proofErr w:type="spellEnd"/>
+      <w:r>
+        <w:rPr>
+          <w:rFonts w:ascii="Calibri" w:hAnsi="Calibri" w:cs="Calibri"/>
+        </w:rPr>
+        <w:t>-off</w:t>
       </w:r>
     </w:p>
     <w:p>
@@ -1639,6 +2044,7 @@
           <w:rFonts w:ascii="Calibri" w:hAnsi="Calibri" w:cs="Calibri"/>
           <w:lang w:val="en-US"/>
         </w:rPr>
+        <w:lastRenderedPageBreak/>
         <w:t>More cycles = better frequency precision, worse temporal precision</w:t>
       </w:r>
     </w:p>
@@ -1671,12 +2077,42 @@
           <w:rFonts w:ascii="Calibri" w:hAnsi="Calibri" w:cs="Calibri"/>
         </w:rPr>
       </w:pPr>
-      <w:r>
-        <w:rPr>
-          <w:rFonts w:ascii="Calibri" w:hAnsi="Calibri" w:cs="Calibri"/>
-        </w:rPr>
-        <w:t>Artifact detection sensitivity</w:t>
-      </w:r>
+      <w:proofErr w:type="spellStart"/>
+      <w:r>
+        <w:rPr>
+          <w:rFonts w:ascii="Calibri" w:hAnsi="Calibri" w:cs="Calibri"/>
+        </w:rPr>
+        <w:t>Artifact</w:t>
+      </w:r>
+      <w:proofErr w:type="spellEnd"/>
+      <w:r>
+        <w:rPr>
+          <w:rFonts w:ascii="Calibri" w:hAnsi="Calibri" w:cs="Calibri"/>
+        </w:rPr>
+        <w:t xml:space="preserve"> </w:t>
+      </w:r>
+      <w:proofErr w:type="spellStart"/>
+      <w:r>
+        <w:rPr>
+          <w:rFonts w:ascii="Calibri" w:hAnsi="Calibri" w:cs="Calibri"/>
+        </w:rPr>
+        <w:t>detection</w:t>
+      </w:r>
+      <w:proofErr w:type="spellEnd"/>
+      <w:r>
+        <w:rPr>
+          <w:rFonts w:ascii="Calibri" w:hAnsi="Calibri" w:cs="Calibri"/>
+        </w:rPr>
+        <w:t xml:space="preserve"> </w:t>
+      </w:r>
+      <w:proofErr w:type="spellStart"/>
+      <w:r>
+        <w:rPr>
+          <w:rFonts w:ascii="Calibri" w:hAnsi="Calibri" w:cs="Calibri"/>
+        </w:rPr>
+        <w:t>sensitivity</w:t>
+      </w:r>
+      <w:proofErr w:type="spellEnd"/>
     </w:p>
     <w:p>
       <w:pPr>
@@ -1738,20 +2174,994 @@
           <w:lang w:val="en-US"/>
         </w:rPr>
       </w:pPr>
-    </w:p>
-    <w:p>
-      <w:pPr>
-        <w:rPr>
-          <w:rFonts w:ascii="Calibri" w:hAnsi="Calibri" w:cs="Calibri"/>
-          <w:lang w:val="en-US"/>
-        </w:rPr>
-      </w:pPr>
       <w:r>
         <w:rPr>
           <w:rFonts w:ascii="Calibri" w:hAnsi="Calibri" w:cs="Calibri"/>
           <w:lang w:val="en-US"/>
         </w:rPr>
         <w:t>Written by ChatGPT.</w:t>
+      </w:r>
+    </w:p>
+    <w:p>
+      <w:pPr>
+        <w:rPr>
+          <w:rFonts w:ascii="Calibri" w:hAnsi="Calibri" w:cs="Calibri"/>
+          <w:lang w:val="en-US"/>
+        </w:rPr>
+      </w:pPr>
+    </w:p>
+    <w:p>
+      <w:pPr>
+        <w:rPr>
+          <w:rFonts w:ascii="Calibri" w:hAnsi="Calibri" w:cs="Calibri"/>
+          <w:b/>
+          <w:bCs/>
+          <w:lang w:val="en-US"/>
+        </w:rPr>
+      </w:pPr>
+      <w:r>
+        <w:rPr>
+          <w:rFonts w:ascii="Calibri" w:hAnsi="Calibri" w:cs="Calibri"/>
+          <w:b/>
+          <w:bCs/>
+          <w:lang w:val="en-US"/>
+        </w:rPr>
+        <w:t xml:space="preserve">Is the GEDAI correction suitable for </w:t>
+      </w:r>
+      <w:r>
+        <w:rPr>
+          <w:rFonts w:ascii="Calibri" w:hAnsi="Calibri" w:cs="Calibri"/>
+          <w:b/>
+          <w:bCs/>
+          <w:lang w:val="en-US"/>
+        </w:rPr>
+        <w:t>any</w:t>
+      </w:r>
+      <w:r>
+        <w:rPr>
+          <w:rFonts w:ascii="Calibri" w:hAnsi="Calibri" w:cs="Calibri"/>
+          <w:b/>
+          <w:bCs/>
+          <w:lang w:val="en-US"/>
+        </w:rPr>
+        <w:t xml:space="preserve"> types of EEG experiment, such ERP</w:t>
+      </w:r>
+      <w:r>
+        <w:rPr>
+          <w:rFonts w:ascii="Calibri" w:hAnsi="Calibri" w:cs="Calibri"/>
+          <w:b/>
+          <w:bCs/>
+          <w:lang w:val="en-US"/>
+        </w:rPr>
+        <w:t xml:space="preserve"> studies (visual, auditory, somatosensory) or </w:t>
+      </w:r>
+      <w:r>
+        <w:rPr>
+          <w:rFonts w:ascii="Calibri" w:hAnsi="Calibri" w:cs="Calibri"/>
+          <w:b/>
+          <w:bCs/>
+          <w:lang w:val="en-US"/>
+        </w:rPr>
+        <w:t>resting state?</w:t>
+      </w:r>
+    </w:p>
+    <w:p>
+      <w:pPr>
+        <w:rPr>
+          <w:rFonts w:ascii="Calibri" w:hAnsi="Calibri" w:cs="Calibri"/>
+          <w:lang w:val="en-US"/>
+        </w:rPr>
+      </w:pPr>
+      <w:r>
+        <w:rPr>
+          <w:rFonts w:ascii="Calibri" w:hAnsi="Calibri" w:cs="Calibri"/>
+          <w:lang w:val="en-US"/>
+        </w:rPr>
+        <w:t>Yes. The GEDAI correction is independent of the task and relies on</w:t>
+      </w:r>
+      <w:r>
+        <w:rPr>
+          <w:rFonts w:ascii="Calibri" w:hAnsi="Calibri" w:cs="Calibri"/>
+          <w:lang w:val="en-US"/>
+        </w:rPr>
+        <w:t xml:space="preserve"> the biophysical spatial constraints of the cerebral EEG.</w:t>
+      </w:r>
+      <w:r>
+        <w:rPr>
+          <w:rFonts w:ascii="Calibri" w:hAnsi="Calibri" w:cs="Calibri"/>
+          <w:lang w:val="en-US"/>
+        </w:rPr>
+        <w:t xml:space="preserve"> </w:t>
+      </w:r>
+      <w:r>
+        <w:rPr>
+          <w:rFonts w:ascii="Calibri" w:hAnsi="Calibri" w:cs="Calibri"/>
+          <w:lang w:val="en-US"/>
+        </w:rPr>
+        <w:t xml:space="preserve">This artefact rejection depends of : </w:t>
+      </w:r>
+    </w:p>
+    <w:p>
+      <w:pPr>
+        <w:pStyle w:val="ListParagraph"/>
+        <w:numPr>
+          <w:ilvl w:val="0"/>
+          <w:numId w:val="10"/>
+        </w:numPr>
+        <w:rPr>
+          <w:rFonts w:ascii="Calibri" w:hAnsi="Calibri" w:cs="Calibri"/>
+          <w:lang w:val="en-US"/>
+        </w:rPr>
+      </w:pPr>
+      <w:r>
+        <w:rPr>
+          <w:rFonts w:ascii="Calibri" w:hAnsi="Calibri" w:cs="Calibri"/>
+          <w:lang w:val="en-US"/>
+        </w:rPr>
+        <w:t>the geometry of the electrodes</w:t>
+      </w:r>
+      <w:r>
+        <w:rPr>
+          <w:rFonts w:ascii="Calibri" w:hAnsi="Calibri" w:cs="Calibri"/>
+          <w:lang w:val="en-US"/>
+        </w:rPr>
+        <w:t xml:space="preserve"> (t</w:t>
+      </w:r>
+      <w:r>
+        <w:rPr>
+          <w:rFonts w:ascii="Calibri" w:hAnsi="Calibri" w:cs="Calibri"/>
+          <w:lang w:val="en-US"/>
+        </w:rPr>
+        <w:t xml:space="preserve">his is why it is mandatory to load a file in the </w:t>
+      </w:r>
+      <w:r>
+        <w:rPr>
+          <w:rFonts w:ascii="Calibri" w:hAnsi="Calibri" w:cs="Calibri"/>
+          <w:i/>
+          <w:iCs/>
+          <w:lang w:val="en-US"/>
+        </w:rPr>
+        <w:t>Electrode Setting</w:t>
+      </w:r>
+      <w:r>
+        <w:rPr>
+          <w:rFonts w:ascii="Calibri" w:hAnsi="Calibri" w:cs="Calibri"/>
+          <w:lang w:val="en-US"/>
+        </w:rPr>
+        <w:t>)</w:t>
+      </w:r>
+      <w:r>
+        <w:rPr>
+          <w:rFonts w:ascii="Calibri" w:hAnsi="Calibri" w:cs="Calibri"/>
+          <w:lang w:val="en-US"/>
+        </w:rPr>
+        <w:t xml:space="preserve"> </w:t>
+      </w:r>
+    </w:p>
+    <w:p>
+      <w:pPr>
+        <w:pStyle w:val="ListParagraph"/>
+        <w:numPr>
+          <w:ilvl w:val="0"/>
+          <w:numId w:val="10"/>
+        </w:numPr>
+        <w:rPr>
+          <w:rFonts w:ascii="Calibri" w:hAnsi="Calibri" w:cs="Calibri"/>
+          <w:lang w:val="en-US"/>
+        </w:rPr>
+      </w:pPr>
+      <w:r>
+        <w:rPr>
+          <w:rFonts w:ascii="Calibri" w:hAnsi="Calibri" w:cs="Calibri"/>
+          <w:lang w:val="en-US"/>
+        </w:rPr>
+        <w:t>the conductive volume</w:t>
+      </w:r>
+    </w:p>
+    <w:p>
+      <w:pPr>
+        <w:pStyle w:val="ListParagraph"/>
+        <w:numPr>
+          <w:ilvl w:val="0"/>
+          <w:numId w:val="10"/>
+        </w:numPr>
+        <w:rPr>
+          <w:rFonts w:ascii="Calibri" w:hAnsi="Calibri" w:cs="Calibri"/>
+          <w:lang w:val="en-US"/>
+        </w:rPr>
+      </w:pPr>
+      <w:r>
+        <w:rPr>
+          <w:rFonts w:ascii="Calibri" w:hAnsi="Calibri" w:cs="Calibri"/>
+          <w:lang w:val="en-US"/>
+        </w:rPr>
+        <w:t xml:space="preserve">the fact that the sources are intracerebral and </w:t>
+      </w:r>
+      <w:r>
+        <w:rPr>
+          <w:rFonts w:ascii="Calibri" w:hAnsi="Calibri" w:cs="Calibri"/>
+          <w:lang w:val="en-US"/>
+        </w:rPr>
+        <w:t>b</w:t>
+      </w:r>
+      <w:r>
+        <w:rPr>
+          <w:rFonts w:ascii="Calibri" w:hAnsi="Calibri" w:cs="Calibri"/>
+          <w:lang w:val="en-US"/>
+        </w:rPr>
+        <w:t>ipolar</w:t>
+      </w:r>
+    </w:p>
+    <w:p>
+      <w:pPr>
+        <w:rPr>
+          <w:rFonts w:ascii="Calibri" w:hAnsi="Calibri" w:cs="Calibri"/>
+          <w:lang w:val="en-US"/>
+        </w:rPr>
+      </w:pPr>
+      <w:r>
+        <w:rPr>
+          <w:rFonts w:ascii="Calibri" w:hAnsi="Calibri" w:cs="Calibri"/>
+          <w:lang w:val="en-US"/>
+        </w:rPr>
+        <w:t xml:space="preserve">It does not depend on: </w:t>
+      </w:r>
+    </w:p>
+    <w:p>
+      <w:pPr>
+        <w:pStyle w:val="ListParagraph"/>
+        <w:numPr>
+          <w:ilvl w:val="0"/>
+          <w:numId w:val="10"/>
+        </w:numPr>
+        <w:rPr>
+          <w:rFonts w:ascii="Calibri" w:hAnsi="Calibri" w:cs="Calibri"/>
+          <w:lang w:val="en-US"/>
+        </w:rPr>
+      </w:pPr>
+      <w:r>
+        <w:rPr>
+          <w:rFonts w:ascii="Calibri" w:hAnsi="Calibri" w:cs="Calibri"/>
+          <w:lang w:val="en-US"/>
+        </w:rPr>
+        <w:t>timing (ERP vs. ongoing)</w:t>
+      </w:r>
+    </w:p>
+    <w:p>
+      <w:pPr>
+        <w:pStyle w:val="ListParagraph"/>
+        <w:numPr>
+          <w:ilvl w:val="0"/>
+          <w:numId w:val="10"/>
+        </w:numPr>
+        <w:rPr>
+          <w:rFonts w:ascii="Calibri" w:hAnsi="Calibri" w:cs="Calibri"/>
+          <w:lang w:val="en-US"/>
+        </w:rPr>
+      </w:pPr>
+      <w:r>
+        <w:rPr>
+          <w:rFonts w:ascii="Calibri" w:hAnsi="Calibri" w:cs="Calibri"/>
+          <w:lang w:val="en-US"/>
+        </w:rPr>
+        <w:t xml:space="preserve">frequency </w:t>
+      </w:r>
+    </w:p>
+    <w:p>
+      <w:pPr>
+        <w:pStyle w:val="ListParagraph"/>
+        <w:numPr>
+          <w:ilvl w:val="0"/>
+          <w:numId w:val="10"/>
+        </w:numPr>
+        <w:rPr>
+          <w:rFonts w:ascii="Calibri" w:hAnsi="Calibri" w:cs="Calibri"/>
+          <w:lang w:val="en-US"/>
+        </w:rPr>
+      </w:pPr>
+      <w:r>
+        <w:rPr>
+          <w:rFonts w:ascii="Calibri" w:hAnsi="Calibri" w:cs="Calibri"/>
+          <w:lang w:val="en-US"/>
+        </w:rPr>
+        <w:t>phase locking</w:t>
+      </w:r>
+    </w:p>
+    <w:p>
+      <w:pPr>
+        <w:pStyle w:val="ListParagraph"/>
+        <w:numPr>
+          <w:ilvl w:val="0"/>
+          <w:numId w:val="10"/>
+        </w:numPr>
+        <w:rPr>
+          <w:rFonts w:ascii="Calibri" w:hAnsi="Calibri" w:cs="Calibri"/>
+          <w:lang w:val="en-US"/>
+        </w:rPr>
+      </w:pPr>
+      <w:r>
+        <w:rPr>
+          <w:rFonts w:ascii="Calibri" w:hAnsi="Calibri" w:cs="Calibri"/>
+          <w:lang w:val="en-US"/>
+        </w:rPr>
+        <w:t>inter-trial repeatability</w:t>
+      </w:r>
+    </w:p>
+    <w:p>
+      <w:pPr>
+        <w:rPr>
+          <w:rFonts w:ascii="Calibri" w:hAnsi="Calibri" w:cs="Calibri"/>
+          <w:lang w:val="en-US"/>
+        </w:rPr>
+      </w:pPr>
+      <w:r>
+        <w:rPr>
+          <w:rFonts w:ascii="Calibri" w:hAnsi="Calibri" w:cs="Calibri"/>
+          <w:lang w:val="en-US"/>
+        </w:rPr>
+        <w:t>Written with the help of ChatGPT</w:t>
+      </w:r>
+    </w:p>
+    <w:p>
+      <w:pPr>
+        <w:rPr>
+          <w:rFonts w:ascii="Calibri" w:hAnsi="Calibri" w:cs="Calibri"/>
+          <w:lang w:val="en-US"/>
+        </w:rPr>
+      </w:pPr>
+    </w:p>
+    <w:p>
+      <w:pPr>
+        <w:rPr>
+          <w:rFonts w:ascii="Calibri" w:hAnsi="Calibri" w:cs="Calibri"/>
+          <w:b/>
+          <w:bCs/>
+          <w:lang w:val="en-US"/>
+        </w:rPr>
+      </w:pPr>
+      <w:r>
+        <w:rPr>
+          <w:rFonts w:ascii="Calibri" w:hAnsi="Calibri" w:cs="Calibri"/>
+          <w:b/>
+          <w:bCs/>
+          <w:lang w:val="en-US"/>
+        </w:rPr>
+        <w:t>Are there any limitations to this artefact rejection method?</w:t>
+      </w:r>
+    </w:p>
+    <w:p>
+      <w:pPr>
+        <w:rPr>
+          <w:rFonts w:ascii="Calibri" w:hAnsi="Calibri" w:cs="Calibri"/>
+          <w:lang w:val="en-US"/>
+        </w:rPr>
+      </w:pPr>
+      <w:r>
+        <w:rPr>
+          <w:rFonts w:ascii="Calibri" w:hAnsi="Calibri" w:cs="Calibri"/>
+          <w:lang w:val="en-US"/>
+        </w:rPr>
+        <w:t xml:space="preserve">As the correction is based on the spatial distribution of the electrodes, it should be reasonable (medium head size, symmetric layout, more or less standard </w:t>
+      </w:r>
+      <w:r>
+        <w:rPr>
+          <w:rFonts w:ascii="Calibri" w:hAnsi="Calibri" w:cs="Calibri"/>
+          <w:lang w:val="en-US"/>
+        </w:rPr>
+        <w:t xml:space="preserve">disposition). </w:t>
+      </w:r>
+      <w:r>
+        <w:rPr>
+          <w:rFonts w:ascii="Calibri" w:hAnsi="Calibri" w:cs="Calibri"/>
+          <w:lang w:val="en-US"/>
+        </w:rPr>
+        <w:t>Efficiency depends on the number of electrodes, so this method is not suitable for single channels.</w:t>
+      </w:r>
+      <w:r>
+        <w:rPr>
+          <w:rFonts w:ascii="Calibri" w:hAnsi="Calibri" w:cs="Calibri"/>
+          <w:lang w:val="en-US"/>
+        </w:rPr>
+        <w:br/>
+      </w:r>
+      <w:r>
+        <w:rPr>
+          <w:rFonts w:ascii="Calibri" w:hAnsi="Calibri" w:cs="Calibri"/>
+          <w:lang w:val="en-US"/>
+        </w:rPr>
+        <w:t xml:space="preserve">In terms of anatomy, the sources of deep brain structures such as the thalamus and the brainstem are not well estimated, and the signals from these regions are not well corrected.  </w:t>
+      </w:r>
+      <w:r>
+        <w:rPr>
+          <w:rFonts w:ascii="Calibri" w:hAnsi="Calibri" w:cs="Calibri"/>
+          <w:lang w:val="en-US"/>
+        </w:rPr>
+        <w:br/>
+      </w:r>
+      <w:r>
+        <w:rPr>
+          <w:rFonts w:ascii="Calibri" w:hAnsi="Calibri" w:cs="Calibri"/>
+          <w:lang w:val="en-US"/>
+        </w:rPr>
+        <w:t>Finally, the reference matrix has been computed for the entire brain.</w:t>
+      </w:r>
+      <w:r>
+        <w:rPr>
+          <w:rFonts w:ascii="Calibri" w:hAnsi="Calibri" w:cs="Calibri"/>
+          <w:lang w:val="en-US"/>
+        </w:rPr>
+        <w:t xml:space="preserve"> The GEDAI</w:t>
+      </w:r>
+      <w:r>
+        <w:rPr>
+          <w:rFonts w:ascii="Calibri" w:hAnsi="Calibri" w:cs="Calibri"/>
+          <w:lang w:val="en-US"/>
+        </w:rPr>
+        <w:t xml:space="preserve"> artefact correction will be less accurate for atypical brain anatomy, such as in patients with cerebral lesions.</w:t>
+      </w:r>
+      <w:r>
+        <w:rPr>
+          <w:rFonts w:ascii="Calibri" w:hAnsi="Calibri" w:cs="Calibri"/>
+          <w:lang w:val="en-US"/>
+        </w:rPr>
+        <w:t xml:space="preserve"> </w:t>
+      </w:r>
+      <w:r>
+        <w:rPr>
+          <w:rFonts w:ascii="Calibri" w:hAnsi="Calibri" w:cs="Calibri"/>
+          <w:lang w:val="en-US"/>
+        </w:rPr>
+        <w:t xml:space="preserve">In addition, the presence of an active neurostimulator cannot be managed and will impair denoising.   </w:t>
+      </w:r>
+    </w:p>
+    <w:p>
+      <w:pPr>
+        <w:rPr>
+          <w:rFonts w:ascii="Calibri" w:hAnsi="Calibri" w:cs="Calibri"/>
+          <w:lang w:val="en-US"/>
+        </w:rPr>
+      </w:pPr>
+    </w:p>
+    <w:p>
+      <w:pPr>
+        <w:rPr>
+          <w:rFonts w:ascii="Calibri" w:hAnsi="Calibri" w:cs="Calibri"/>
+          <w:b/>
+          <w:bCs/>
+          <w:lang w:val="en-US"/>
+        </w:rPr>
+      </w:pPr>
+      <w:r>
+        <w:rPr>
+          <w:rFonts w:ascii="Calibri" w:hAnsi="Calibri" w:cs="Calibri"/>
+          <w:b/>
+          <w:bCs/>
+          <w:lang w:val="en-US"/>
+        </w:rPr>
+        <w:t xml:space="preserve">Is it better to work with filtered or raw EEG signal when using GEDAI toolbox? </w:t>
+      </w:r>
+    </w:p>
+    <w:p>
+      <w:pPr>
+        <w:rPr>
+          <w:rFonts w:ascii="Calibri" w:hAnsi="Calibri" w:cs="Calibri"/>
+          <w:lang w:val="en-US"/>
+        </w:rPr>
+      </w:pPr>
+      <w:r>
+        <w:rPr>
+          <w:rFonts w:ascii="Calibri" w:hAnsi="Calibri" w:cs="Calibri"/>
+          <w:lang w:val="en-US"/>
+        </w:rPr>
+        <w:t xml:space="preserve">Very low-frequency noise, such as signal drift, would cause problems with GEDAI corrections. </w:t>
+      </w:r>
+      <w:r>
+        <w:rPr>
+          <w:rFonts w:ascii="Calibri" w:hAnsi="Calibri" w:cs="Calibri"/>
+          <w:lang w:val="en-US"/>
+        </w:rPr>
+        <w:t xml:space="preserve">Therefore, it is recommended that you apply a high-pass filter to your signal and correct the line </w:t>
+      </w:r>
+      <w:r>
+        <w:rPr>
+          <w:rFonts w:ascii="Calibri" w:hAnsi="Calibri" w:cs="Calibri"/>
+          <w:lang w:val="en-US"/>
+        </w:rPr>
+        <w:lastRenderedPageBreak/>
+        <w:t xml:space="preserve">noise using either a 50 Hz notch filter or the </w:t>
+      </w:r>
+      <w:proofErr w:type="spellStart"/>
+      <w:r>
+        <w:rPr>
+          <w:rFonts w:ascii="Calibri" w:hAnsi="Calibri" w:cs="Calibri"/>
+          <w:lang w:val="en-US"/>
+        </w:rPr>
+        <w:t>CleanLine</w:t>
+      </w:r>
+      <w:proofErr w:type="spellEnd"/>
+      <w:r>
+        <w:rPr>
+          <w:rFonts w:ascii="Calibri" w:hAnsi="Calibri" w:cs="Calibri"/>
+          <w:lang w:val="en-US"/>
+        </w:rPr>
+        <w:t xml:space="preserve"> toolbox. If you are working with a raw signal, you will need to use the 'Low-cut frequency (Hz)' parameter from the GEDAI toolbox to apply a high-pass filter before artefact correction. </w:t>
+      </w:r>
+    </w:p>
+    <w:p>
+      <w:pPr>
+        <w:rPr>
+          <w:rFonts w:ascii="Calibri" w:hAnsi="Calibri" w:cs="Calibri"/>
+          <w:lang w:val="en-US"/>
+        </w:rPr>
+      </w:pPr>
+      <w:r>
+        <w:rPr>
+          <w:rFonts w:ascii="Calibri" w:hAnsi="Calibri" w:cs="Calibri"/>
+          <w:lang w:val="en-US"/>
+        </w:rPr>
+        <w:t xml:space="preserve">Applying a low-pass filter to the data (e.g. at 40 Hz) will not </w:t>
+      </w:r>
+      <w:r>
+        <w:rPr>
+          <w:rFonts w:ascii="Calibri" w:hAnsi="Calibri" w:cs="Calibri"/>
+          <w:lang w:val="en-US"/>
+        </w:rPr>
+        <w:t>impair</w:t>
+      </w:r>
+      <w:r>
+        <w:rPr>
+          <w:rFonts w:ascii="Calibri" w:hAnsi="Calibri" w:cs="Calibri"/>
+          <w:lang w:val="en-US"/>
+        </w:rPr>
+        <w:t xml:space="preserve"> the GEDAI </w:t>
+      </w:r>
+      <w:r>
+        <w:rPr>
+          <w:rFonts w:ascii="Calibri" w:hAnsi="Calibri" w:cs="Calibri"/>
+          <w:lang w:val="en-US"/>
+        </w:rPr>
+        <w:t>work</w:t>
+      </w:r>
+      <w:r>
+        <w:rPr>
+          <w:rFonts w:ascii="Calibri" w:hAnsi="Calibri" w:cs="Calibri"/>
+          <w:lang w:val="en-US"/>
+        </w:rPr>
+        <w:t xml:space="preserve">. </w:t>
+      </w:r>
+    </w:p>
+    <w:p>
+      <w:pPr>
+        <w:rPr>
+          <w:rFonts w:ascii="Calibri" w:hAnsi="Calibri" w:cs="Calibri"/>
+          <w:lang w:val="en-US"/>
+        </w:rPr>
+      </w:pPr>
+      <w:r>
+        <w:rPr>
+          <w:rFonts w:ascii="Calibri" w:hAnsi="Calibri" w:cs="Calibri"/>
+          <w:lang w:val="en-US"/>
+        </w:rPr>
+        <w:t xml:space="preserve">In summary, it is advisable to apply filters using the </w:t>
+      </w:r>
+      <w:r>
+        <w:rPr>
+          <w:rFonts w:ascii="Calibri" w:hAnsi="Calibri" w:cs="Calibri"/>
+          <w:i/>
+          <w:iCs/>
+          <w:lang w:val="en-US"/>
+        </w:rPr>
+        <w:t>Filtering+</w:t>
+      </w:r>
+      <w:r>
+        <w:rPr>
+          <w:rFonts w:ascii="Calibri" w:hAnsi="Calibri" w:cs="Calibri"/>
+          <w:lang w:val="en-US"/>
+        </w:rPr>
+        <w:t xml:space="preserve"> module before proceeding to the GEDAI module.</w:t>
+      </w:r>
+    </w:p>
+    <w:p>
+      <w:pPr>
+        <w:rPr>
+          <w:rFonts w:ascii="Calibri" w:hAnsi="Calibri" w:cs="Calibri"/>
+          <w:lang w:val="en-US"/>
+        </w:rPr>
+      </w:pPr>
+    </w:p>
+    <w:p>
+      <w:pPr>
+        <w:rPr>
+          <w:rFonts w:ascii="Calibri" w:hAnsi="Calibri" w:cs="Calibri"/>
+          <w:b/>
+          <w:bCs/>
+          <w:lang w:val="en-US"/>
+        </w:rPr>
+      </w:pPr>
+      <w:r>
+        <w:rPr>
+          <w:rFonts w:ascii="Calibri" w:hAnsi="Calibri" w:cs="Calibri"/>
+          <w:b/>
+          <w:bCs/>
+          <w:lang w:val="en-US"/>
+        </w:rPr>
+        <w:t>Is GEDAI changing the references used in the data?</w:t>
+      </w:r>
+    </w:p>
+    <w:p>
+      <w:pPr>
+        <w:rPr>
+          <w:rFonts w:ascii="Calibri" w:hAnsi="Calibri" w:cs="Calibri"/>
+          <w:lang w:val="en-US"/>
+        </w:rPr>
+      </w:pPr>
+      <w:r>
+        <w:rPr>
+          <w:rFonts w:ascii="Calibri" w:hAnsi="Calibri" w:cs="Calibri"/>
+          <w:lang w:val="en-US"/>
+        </w:rPr>
+        <w:t xml:space="preserve">Yes, the output files generated by the GEDAI toolbox will be automatically re-referenced to the average. However, it is still necessary to re-reference the signal to the average using the </w:t>
+      </w:r>
+      <w:r>
+        <w:rPr>
+          <w:rFonts w:ascii="Calibri" w:hAnsi="Calibri" w:cs="Calibri"/>
+          <w:i/>
+          <w:iCs/>
+          <w:lang w:val="en-US"/>
+        </w:rPr>
+        <w:t>Re-reference module</w:t>
+      </w:r>
+      <w:r>
+        <w:rPr>
+          <w:rFonts w:ascii="Calibri" w:hAnsi="Calibri" w:cs="Calibri"/>
+          <w:lang w:val="en-US"/>
+        </w:rPr>
+        <w:t xml:space="preserve"> after interpolation, in order to remove the impact of bad channels.</w:t>
+      </w:r>
+    </w:p>
+    <w:p>
+      <w:pPr>
+        <w:rPr>
+          <w:rFonts w:ascii="Calibri" w:hAnsi="Calibri" w:cs="Calibri"/>
+          <w:lang w:val="en-US"/>
+        </w:rPr>
+      </w:pPr>
+    </w:p>
+    <w:p>
+      <w:pPr>
+        <w:rPr>
+          <w:rFonts w:ascii="Calibri" w:hAnsi="Calibri" w:cs="Calibri"/>
+          <w:b/>
+          <w:bCs/>
+          <w:lang w:val="en-US"/>
+        </w:rPr>
+      </w:pPr>
+      <w:r>
+        <w:rPr>
+          <w:rFonts w:ascii="Calibri" w:hAnsi="Calibri" w:cs="Calibri"/>
+          <w:b/>
+          <w:bCs/>
+          <w:lang w:val="en-US"/>
+        </w:rPr>
+        <w:t xml:space="preserve">What is the recommended processing pipeline for an ERP study using </w:t>
+      </w:r>
+      <w:r>
+        <w:rPr>
+          <w:rFonts w:ascii="Calibri" w:hAnsi="Calibri" w:cs="Calibri"/>
+          <w:b/>
+          <w:bCs/>
+          <w:lang w:val="en-US"/>
+        </w:rPr>
+        <w:t xml:space="preserve">the </w:t>
+      </w:r>
+      <w:r>
+        <w:rPr>
+          <w:rFonts w:ascii="Calibri" w:hAnsi="Calibri" w:cs="Calibri"/>
+          <w:b/>
+          <w:bCs/>
+          <w:lang w:val="en-US"/>
+        </w:rPr>
+        <w:t>GEDAI toolbox</w:t>
+      </w:r>
+      <w:r>
+        <w:rPr>
+          <w:rFonts w:ascii="Calibri" w:hAnsi="Calibri" w:cs="Calibri"/>
+          <w:b/>
+          <w:bCs/>
+          <w:lang w:val="en-US"/>
+        </w:rPr>
+        <w:t xml:space="preserve">? </w:t>
+      </w:r>
+    </w:p>
+    <w:p>
+      <w:pPr>
+        <w:rPr>
+          <w:rFonts w:ascii="Calibri" w:hAnsi="Calibri" w:cs="Calibri"/>
+          <w:lang w:val="en-US"/>
+        </w:rPr>
+      </w:pPr>
+      <w:r>
+        <w:rPr>
+          <w:rFonts w:ascii="Calibri" w:hAnsi="Calibri" w:cs="Calibri"/>
+          <w:lang w:val="en-US"/>
+        </w:rPr>
+        <w:t xml:space="preserve">I would </w:t>
+      </w:r>
+      <w:r>
+        <w:rPr>
+          <w:rFonts w:ascii="Calibri" w:hAnsi="Calibri" w:cs="Calibri"/>
+          <w:lang w:val="en-US"/>
+        </w:rPr>
+        <w:t>recommend</w:t>
+      </w:r>
+      <w:r>
+        <w:rPr>
+          <w:rFonts w:ascii="Calibri" w:hAnsi="Calibri" w:cs="Calibri"/>
+          <w:lang w:val="en-US"/>
+        </w:rPr>
+        <w:t xml:space="preserve"> </w:t>
+      </w:r>
+      <w:r>
+        <w:rPr>
+          <w:rFonts w:ascii="Calibri" w:hAnsi="Calibri" w:cs="Calibri"/>
+          <w:lang w:val="en-US"/>
+        </w:rPr>
+        <w:t>using</w:t>
+      </w:r>
+      <w:r>
+        <w:rPr>
+          <w:rFonts w:ascii="Calibri" w:hAnsi="Calibri" w:cs="Calibri"/>
+          <w:lang w:val="en-US"/>
+        </w:rPr>
+        <w:t xml:space="preserve"> a similar processing pipeline as usual but without ASR or ICA: </w:t>
+      </w:r>
+    </w:p>
+    <w:p>
+      <w:pPr>
+        <w:pStyle w:val="ListParagraph"/>
+        <w:numPr>
+          <w:ilvl w:val="0"/>
+          <w:numId w:val="9"/>
+        </w:numPr>
+        <w:rPr>
+          <w:rFonts w:ascii="Calibri" w:hAnsi="Calibri" w:cs="Calibri"/>
+          <w:lang w:val="en-US"/>
+        </w:rPr>
+      </w:pPr>
+      <w:r>
+        <w:rPr>
+          <w:rFonts w:ascii="Calibri" w:hAnsi="Calibri" w:cs="Calibri"/>
+          <w:lang w:val="en-US"/>
+        </w:rPr>
+        <w:t>Bridge Detection</w:t>
+      </w:r>
+    </w:p>
+    <w:p>
+      <w:pPr>
+        <w:pStyle w:val="ListParagraph"/>
+        <w:numPr>
+          <w:ilvl w:val="0"/>
+          <w:numId w:val="9"/>
+        </w:numPr>
+        <w:rPr>
+          <w:rFonts w:ascii="Calibri" w:hAnsi="Calibri" w:cs="Calibri"/>
+          <w:lang w:val="en-US"/>
+        </w:rPr>
+      </w:pPr>
+      <w:r>
+        <w:rPr>
+          <w:rFonts w:ascii="Calibri" w:hAnsi="Calibri" w:cs="Calibri"/>
+          <w:lang w:val="en-US"/>
+        </w:rPr>
+        <w:t xml:space="preserve">Filtering +: Apply a high-pass filter with a threshold of at least 0.5 Hz and deactivate the </w:t>
+      </w:r>
+      <w:r>
+        <w:rPr>
+          <w:rFonts w:ascii="Calibri" w:hAnsi="Calibri" w:cs="Calibri"/>
+          <w:i/>
+          <w:iCs/>
+          <w:lang w:val="en-US"/>
+        </w:rPr>
+        <w:t>ASR bad burst correction</w:t>
+      </w:r>
+      <w:r>
+        <w:rPr>
+          <w:rFonts w:ascii="Calibri" w:hAnsi="Calibri" w:cs="Calibri"/>
+          <w:lang w:val="en-US"/>
+        </w:rPr>
+        <w:t xml:space="preserve"> and </w:t>
+      </w:r>
+      <w:r>
+        <w:rPr>
+          <w:rFonts w:ascii="Calibri" w:hAnsi="Calibri" w:cs="Calibri"/>
+          <w:i/>
+          <w:iCs/>
+          <w:lang w:val="en-US"/>
+        </w:rPr>
+        <w:t>Additional removal of bad data periods</w:t>
+      </w:r>
+      <w:r>
+        <w:rPr>
+          <w:rFonts w:ascii="Calibri" w:hAnsi="Calibri" w:cs="Calibri"/>
+          <w:lang w:val="en-US"/>
+        </w:rPr>
+        <w:t xml:space="preserve"> options for CLEAN RAWDATA</w:t>
+      </w:r>
+    </w:p>
+    <w:p>
+      <w:pPr>
+        <w:pStyle w:val="ListParagraph"/>
+        <w:numPr>
+          <w:ilvl w:val="0"/>
+          <w:numId w:val="9"/>
+        </w:numPr>
+        <w:rPr>
+          <w:rFonts w:ascii="Calibri" w:hAnsi="Calibri" w:cs="Calibri"/>
+          <w:lang w:val="en-US"/>
+        </w:rPr>
+      </w:pPr>
+      <w:r>
+        <w:rPr>
+          <w:rFonts w:ascii="Calibri" w:hAnsi="Calibri" w:cs="Calibri"/>
+          <w:lang w:val="en-US"/>
+        </w:rPr>
+        <w:t xml:space="preserve">GEDAI: use the GEDAI toolbox </w:t>
+      </w:r>
+      <w:r>
+        <w:rPr>
+          <w:rFonts w:ascii="Calibri" w:hAnsi="Calibri" w:cs="Calibri"/>
+          <w:lang w:val="en-US"/>
+        </w:rPr>
+        <w:t xml:space="preserve">with the same </w:t>
+      </w:r>
+      <w:r>
+        <w:rPr>
+          <w:rFonts w:ascii="Calibri" w:hAnsi="Calibri" w:cs="Calibri"/>
+          <w:i/>
+          <w:iCs/>
+          <w:lang w:val="en-US"/>
+        </w:rPr>
+        <w:t>Low-cut frequency value</w:t>
+      </w:r>
+      <w:r>
+        <w:rPr>
+          <w:rFonts w:ascii="Calibri" w:hAnsi="Calibri" w:cs="Calibri"/>
+          <w:lang w:val="en-US"/>
+        </w:rPr>
+        <w:t xml:space="preserve"> as the high-pass threshold used in step 2. Do not activate </w:t>
+      </w:r>
+      <w:r>
+        <w:rPr>
+          <w:rFonts w:ascii="Calibri" w:hAnsi="Calibri" w:cs="Calibri"/>
+          <w:lang w:val="en-US"/>
+        </w:rPr>
+        <w:t xml:space="preserve">the option </w:t>
+      </w:r>
+      <w:r>
+        <w:rPr>
+          <w:rFonts w:ascii="Calibri" w:hAnsi="Calibri" w:cs="Calibri"/>
+          <w:i/>
+          <w:iCs/>
+          <w:lang w:val="en-US"/>
+        </w:rPr>
+        <w:t>Reject bad epochs</w:t>
+      </w:r>
+      <w:r>
+        <w:rPr>
+          <w:rFonts w:ascii="Calibri" w:hAnsi="Calibri" w:cs="Calibri"/>
+          <w:lang w:val="en-US"/>
+        </w:rPr>
+        <w:t>.</w:t>
+      </w:r>
+      <w:r>
+        <w:rPr>
+          <w:rFonts w:ascii="Calibri" w:hAnsi="Calibri" w:cs="Calibri"/>
+          <w:i/>
+          <w:iCs/>
+          <w:lang w:val="en-US"/>
+        </w:rPr>
+        <w:t xml:space="preserve"> </w:t>
+      </w:r>
+    </w:p>
+    <w:p>
+      <w:pPr>
+        <w:pStyle w:val="ListParagraph"/>
+        <w:numPr>
+          <w:ilvl w:val="0"/>
+          <w:numId w:val="9"/>
+        </w:numPr>
+        <w:rPr>
+          <w:rFonts w:ascii="Calibri" w:hAnsi="Calibri" w:cs="Calibri"/>
+          <w:lang w:val="en-US"/>
+        </w:rPr>
+      </w:pPr>
+      <w:r>
+        <w:rPr>
+          <w:rFonts w:ascii="Calibri" w:hAnsi="Calibri" w:cs="Calibri"/>
+          <w:lang w:val="en-US"/>
+        </w:rPr>
+        <w:t>Interpolation: Make a visual inspection of your signal to check for bad electrodes. Interpolate them with the bridged channels detect in step 1</w:t>
+      </w:r>
+    </w:p>
+    <w:p>
+      <w:pPr>
+        <w:pStyle w:val="ListParagraph"/>
+        <w:numPr>
+          <w:ilvl w:val="0"/>
+          <w:numId w:val="9"/>
+        </w:numPr>
+        <w:rPr>
+          <w:rFonts w:ascii="Calibri" w:hAnsi="Calibri" w:cs="Calibri"/>
+          <w:lang w:val="en-US"/>
+        </w:rPr>
+      </w:pPr>
+      <w:r>
+        <w:rPr>
+          <w:rFonts w:ascii="Calibri" w:hAnsi="Calibri" w:cs="Calibri"/>
+          <w:lang w:val="en-US"/>
+        </w:rPr>
+        <w:t xml:space="preserve">Re-reference: Re-reference to </w:t>
+      </w:r>
+      <w:r>
+        <w:rPr>
+          <w:rFonts w:ascii="Calibri" w:hAnsi="Calibri" w:cs="Calibri"/>
+          <w:i/>
+          <w:iCs/>
+          <w:lang w:val="en-US"/>
+        </w:rPr>
+        <w:t>average reference</w:t>
+      </w:r>
+      <w:r>
+        <w:rPr>
+          <w:rFonts w:ascii="Calibri" w:hAnsi="Calibri" w:cs="Calibri"/>
+          <w:lang w:val="en-US"/>
+        </w:rPr>
+        <w:t xml:space="preserve"> to correct the impact of bad channels on the signal</w:t>
+      </w:r>
+    </w:p>
+    <w:p>
+      <w:pPr>
+        <w:pStyle w:val="ListParagraph"/>
+        <w:numPr>
+          <w:ilvl w:val="0"/>
+          <w:numId w:val="9"/>
+        </w:numPr>
+        <w:rPr>
+          <w:rFonts w:ascii="Calibri" w:hAnsi="Calibri" w:cs="Calibri"/>
+          <w:lang w:val="en-US"/>
+        </w:rPr>
+      </w:pPr>
+      <w:proofErr w:type="spellStart"/>
+      <w:r>
+        <w:rPr>
+          <w:rFonts w:ascii="Calibri" w:hAnsi="Calibri" w:cs="Calibri"/>
+          <w:lang w:val="en-US"/>
+        </w:rPr>
+        <w:t>Epoching</w:t>
+      </w:r>
+      <w:proofErr w:type="spellEnd"/>
+      <w:r>
+        <w:rPr>
+          <w:rFonts w:ascii="Calibri" w:hAnsi="Calibri" w:cs="Calibri"/>
+          <w:lang w:val="en-US"/>
+        </w:rPr>
+        <w:t xml:space="preserve">: Use the </w:t>
+      </w:r>
+      <w:proofErr w:type="spellStart"/>
+      <w:r>
+        <w:rPr>
+          <w:rFonts w:ascii="Calibri" w:hAnsi="Calibri" w:cs="Calibri"/>
+          <w:lang w:val="en-US"/>
+        </w:rPr>
+        <w:t>Epoching</w:t>
+      </w:r>
+      <w:proofErr w:type="spellEnd"/>
+      <w:r>
+        <w:rPr>
+          <w:rFonts w:ascii="Calibri" w:hAnsi="Calibri" w:cs="Calibri"/>
+          <w:lang w:val="en-US"/>
+        </w:rPr>
+        <w:t xml:space="preserve"> module as usual to create your Evoked Related Potential (ERP) files.</w:t>
       </w:r>
     </w:p>
     <w:p>
@@ -1996,6 +3406,95 @@
     </w:lvl>
   </w:abstractNum>
   <w:abstractNum w:abstractNumId="1" w15:restartNumberingAfterBreak="0">
+    <w:nsid w:val="1F7205E3"/>
+    <w:multiLevelType w:val="hybridMultilevel"/>
+    <w:tmpl w:val="FE20A1F0"/>
+    <w:lvl w:ilvl="0" w:tplc="100C0011">
+      <w:start w:val="1"/>
+      <w:numFmt w:val="decimal"/>
+      <w:lvlText w:val="%1)"/>
+      <w:lvlJc w:val="left"/>
+      <w:pPr>
+        <w:ind w:left="720" w:hanging="360"/>
+      </w:pPr>
+      <w:rPr>
+        <w:rFonts w:hint="default"/>
+      </w:rPr>
+    </w:lvl>
+    <w:lvl w:ilvl="1" w:tplc="100C0019" w:tentative="1">
+      <w:start w:val="1"/>
+      <w:numFmt w:val="lowerLetter"/>
+      <w:lvlText w:val="%2."/>
+      <w:lvlJc w:val="left"/>
+      <w:pPr>
+        <w:ind w:left="1440" w:hanging="360"/>
+      </w:pPr>
+    </w:lvl>
+    <w:lvl w:ilvl="2" w:tplc="100C001B" w:tentative="1">
+      <w:start w:val="1"/>
+      <w:numFmt w:val="lowerRoman"/>
+      <w:lvlText w:val="%3."/>
+      <w:lvlJc w:val="right"/>
+      <w:pPr>
+        <w:ind w:left="2160" w:hanging="180"/>
+      </w:pPr>
+    </w:lvl>
+    <w:lvl w:ilvl="3" w:tplc="100C000F" w:tentative="1">
+      <w:start w:val="1"/>
+      <w:numFmt w:val="decimal"/>
+      <w:lvlText w:val="%4."/>
+      <w:lvlJc w:val="left"/>
+      <w:pPr>
+        <w:ind w:left="2880" w:hanging="360"/>
+      </w:pPr>
+    </w:lvl>
+    <w:lvl w:ilvl="4" w:tplc="100C0019" w:tentative="1">
+      <w:start w:val="1"/>
+      <w:numFmt w:val="lowerLetter"/>
+      <w:lvlText w:val="%5."/>
+      <w:lvlJc w:val="left"/>
+      <w:pPr>
+        <w:ind w:left="3600" w:hanging="360"/>
+      </w:pPr>
+    </w:lvl>
+    <w:lvl w:ilvl="5" w:tplc="100C001B" w:tentative="1">
+      <w:start w:val="1"/>
+      <w:numFmt w:val="lowerRoman"/>
+      <w:lvlText w:val="%6."/>
+      <w:lvlJc w:val="right"/>
+      <w:pPr>
+        <w:ind w:left="4320" w:hanging="180"/>
+      </w:pPr>
+    </w:lvl>
+    <w:lvl w:ilvl="6" w:tplc="100C000F" w:tentative="1">
+      <w:start w:val="1"/>
+      <w:numFmt w:val="decimal"/>
+      <w:lvlText w:val="%7."/>
+      <w:lvlJc w:val="left"/>
+      <w:pPr>
+        <w:ind w:left="5040" w:hanging="360"/>
+      </w:pPr>
+    </w:lvl>
+    <w:lvl w:ilvl="7" w:tplc="100C0019" w:tentative="1">
+      <w:start w:val="1"/>
+      <w:numFmt w:val="lowerLetter"/>
+      <w:lvlText w:val="%8."/>
+      <w:lvlJc w:val="left"/>
+      <w:pPr>
+        <w:ind w:left="5760" w:hanging="360"/>
+      </w:pPr>
+    </w:lvl>
+    <w:lvl w:ilvl="8" w:tplc="100C001B" w:tentative="1">
+      <w:start w:val="1"/>
+      <w:numFmt w:val="lowerRoman"/>
+      <w:lvlText w:val="%9."/>
+      <w:lvlJc w:val="right"/>
+      <w:pPr>
+        <w:ind w:left="6480" w:hanging="180"/>
+      </w:pPr>
+    </w:lvl>
+  </w:abstractNum>
+  <w:abstractNum w:abstractNumId="2" w15:restartNumberingAfterBreak="0">
     <w:nsid w:val="30FB5B1B"/>
     <w:multiLevelType w:val="hybridMultilevel"/>
     <w:tmpl w:val="8EFC049C"/>
@@ -2084,7 +3583,7 @@
       </w:pPr>
     </w:lvl>
   </w:abstractNum>
-  <w:abstractNum w:abstractNumId="2" w15:restartNumberingAfterBreak="0">
+  <w:abstractNum w:abstractNumId="3" w15:restartNumberingAfterBreak="0">
     <w:nsid w:val="38A13465"/>
     <w:multiLevelType w:val="hybridMultilevel"/>
     <w:tmpl w:val="8396749C"/>
@@ -2173,7 +3672,7 @@
       </w:pPr>
     </w:lvl>
   </w:abstractNum>
-  <w:abstractNum w:abstractNumId="3" w15:restartNumberingAfterBreak="0">
+  <w:abstractNum w:abstractNumId="4" w15:restartNumberingAfterBreak="0">
     <w:nsid w:val="44B229E3"/>
     <w:multiLevelType w:val="multilevel"/>
     <w:tmpl w:val="5BC40334"/>
@@ -2322,7 +3821,7 @@
       </w:rPr>
     </w:lvl>
   </w:abstractNum>
-  <w:abstractNum w:abstractNumId="4" w15:restartNumberingAfterBreak="0">
+  <w:abstractNum w:abstractNumId="5" w15:restartNumberingAfterBreak="0">
     <w:nsid w:val="62FE6DBB"/>
     <w:multiLevelType w:val="multilevel"/>
     <w:tmpl w:val="F54E3E56"/>
@@ -2471,7 +3970,120 @@
       </w:rPr>
     </w:lvl>
   </w:abstractNum>
-  <w:abstractNum w:abstractNumId="5" w15:restartNumberingAfterBreak="0">
+  <w:abstractNum w:abstractNumId="6" w15:restartNumberingAfterBreak="0">
+    <w:nsid w:val="67AA39BA"/>
+    <w:multiLevelType w:val="hybridMultilevel"/>
+    <w:tmpl w:val="991653D2"/>
+    <w:lvl w:ilvl="0" w:tplc="DF88F460">
+      <w:start w:val="1"/>
+      <w:numFmt w:val="bullet"/>
+      <w:lvlText w:val="-"/>
+      <w:lvlJc w:val="left"/>
+      <w:pPr>
+        <w:ind w:left="720" w:hanging="360"/>
+      </w:pPr>
+      <w:rPr>
+        <w:rFonts w:ascii="Calibri" w:eastAsiaTheme="minorHAnsi" w:hAnsi="Calibri" w:cs="Calibri" w:hint="default"/>
+      </w:rPr>
+    </w:lvl>
+    <w:lvl w:ilvl="1" w:tplc="100C0003" w:tentative="1">
+      <w:start w:val="1"/>
+      <w:numFmt w:val="bullet"/>
+      <w:lvlText w:val="o"/>
+      <w:lvlJc w:val="left"/>
+      <w:pPr>
+        <w:ind w:left="1440" w:hanging="360"/>
+      </w:pPr>
+      <w:rPr>
+        <w:rFonts w:ascii="Courier New" w:hAnsi="Courier New" w:cs="Courier New" w:hint="default"/>
+      </w:rPr>
+    </w:lvl>
+    <w:lvl w:ilvl="2" w:tplc="100C0005" w:tentative="1">
+      <w:start w:val="1"/>
+      <w:numFmt w:val="bullet"/>
+      <w:lvlText w:val=""/>
+      <w:lvlJc w:val="left"/>
+      <w:pPr>
+        <w:ind w:left="2160" w:hanging="360"/>
+      </w:pPr>
+      <w:rPr>
+        <w:rFonts w:ascii="Wingdings" w:hAnsi="Wingdings" w:hint="default"/>
+      </w:rPr>
+    </w:lvl>
+    <w:lvl w:ilvl="3" w:tplc="100C0001" w:tentative="1">
+      <w:start w:val="1"/>
+      <w:numFmt w:val="bullet"/>
+      <w:lvlText w:val=""/>
+      <w:lvlJc w:val="left"/>
+      <w:pPr>
+        <w:ind w:left="2880" w:hanging="360"/>
+      </w:pPr>
+      <w:rPr>
+        <w:rFonts w:ascii="Symbol" w:hAnsi="Symbol" w:hint="default"/>
+      </w:rPr>
+    </w:lvl>
+    <w:lvl w:ilvl="4" w:tplc="100C0003" w:tentative="1">
+      <w:start w:val="1"/>
+      <w:numFmt w:val="bullet"/>
+      <w:lvlText w:val="o"/>
+      <w:lvlJc w:val="left"/>
+      <w:pPr>
+        <w:ind w:left="3600" w:hanging="360"/>
+      </w:pPr>
+      <w:rPr>
+        <w:rFonts w:ascii="Courier New" w:hAnsi="Courier New" w:cs="Courier New" w:hint="default"/>
+      </w:rPr>
+    </w:lvl>
+    <w:lvl w:ilvl="5" w:tplc="100C0005" w:tentative="1">
+      <w:start w:val="1"/>
+      <w:numFmt w:val="bullet"/>
+      <w:lvlText w:val=""/>
+      <w:lvlJc w:val="left"/>
+      <w:pPr>
+        <w:ind w:left="4320" w:hanging="360"/>
+      </w:pPr>
+      <w:rPr>
+        <w:rFonts w:ascii="Wingdings" w:hAnsi="Wingdings" w:hint="default"/>
+      </w:rPr>
+    </w:lvl>
+    <w:lvl w:ilvl="6" w:tplc="100C0001" w:tentative="1">
+      <w:start w:val="1"/>
+      <w:numFmt w:val="bullet"/>
+      <w:lvlText w:val=""/>
+      <w:lvlJc w:val="left"/>
+      <w:pPr>
+        <w:ind w:left="5040" w:hanging="360"/>
+      </w:pPr>
+      <w:rPr>
+        <w:rFonts w:ascii="Symbol" w:hAnsi="Symbol" w:hint="default"/>
+      </w:rPr>
+    </w:lvl>
+    <w:lvl w:ilvl="7" w:tplc="100C0003" w:tentative="1">
+      <w:start w:val="1"/>
+      <w:numFmt w:val="bullet"/>
+      <w:lvlText w:val="o"/>
+      <w:lvlJc w:val="left"/>
+      <w:pPr>
+        <w:ind w:left="5760" w:hanging="360"/>
+      </w:pPr>
+      <w:rPr>
+        <w:rFonts w:ascii="Courier New" w:hAnsi="Courier New" w:cs="Courier New" w:hint="default"/>
+      </w:rPr>
+    </w:lvl>
+    <w:lvl w:ilvl="8" w:tplc="100C0005" w:tentative="1">
+      <w:start w:val="1"/>
+      <w:numFmt w:val="bullet"/>
+      <w:lvlText w:val=""/>
+      <w:lvlJc w:val="left"/>
+      <w:pPr>
+        <w:ind w:left="6480" w:hanging="360"/>
+      </w:pPr>
+      <w:rPr>
+        <w:rFonts w:ascii="Wingdings" w:hAnsi="Wingdings" w:hint="default"/>
+      </w:rPr>
+    </w:lvl>
+  </w:abstractNum>
+  <w:abstractNum w:abstractNumId="7" w15:restartNumberingAfterBreak="0">
     <w:nsid w:val="693E2EC1"/>
     <w:multiLevelType w:val="hybridMultilevel"/>
     <w:tmpl w:val="64CC47EC"/>
@@ -2583,7 +4195,7 @@
       </w:rPr>
     </w:lvl>
   </w:abstractNum>
-  <w:abstractNum w:abstractNumId="6" w15:restartNumberingAfterBreak="0">
+  <w:abstractNum w:abstractNumId="8" w15:restartNumberingAfterBreak="0">
     <w:nsid w:val="759A6A24"/>
     <w:multiLevelType w:val="multilevel"/>
     <w:tmpl w:val="7B54C7E4"/>
@@ -2732,7 +4344,7 @@
       </w:rPr>
     </w:lvl>
   </w:abstractNum>
-  <w:abstractNum w:abstractNumId="7" w15:restartNumberingAfterBreak="0">
+  <w:abstractNum w:abstractNumId="9" w15:restartNumberingAfterBreak="0">
     <w:nsid w:val="79C13DAD"/>
     <w:multiLevelType w:val="hybridMultilevel"/>
     <w:tmpl w:val="8396749C"/>
@@ -2822,28 +4434,34 @@
     </w:lvl>
   </w:abstractNum>
   <w:num w:numId="1" w16cid:durableId="1871911421">
+    <w:abstractNumId w:val="3"/>
+  </w:num>
+  <w:num w:numId="2" w16cid:durableId="1601183589">
+    <w:abstractNumId w:val="9"/>
+  </w:num>
+  <w:num w:numId="3" w16cid:durableId="1237478245">
     <w:abstractNumId w:val="2"/>
   </w:num>
-  <w:num w:numId="2" w16cid:durableId="1601183589">
+  <w:num w:numId="4" w16cid:durableId="1351641300">
     <w:abstractNumId w:val="7"/>
   </w:num>
-  <w:num w:numId="3" w16cid:durableId="1237478245">
-    <w:abstractNumId w:val="1"/>
+  <w:num w:numId="5" w16cid:durableId="2087264557">
+    <w:abstractNumId w:val="8"/>
   </w:num>
-  <w:num w:numId="4" w16cid:durableId="1351641300">
+  <w:num w:numId="6" w16cid:durableId="2016106074">
     <w:abstractNumId w:val="5"/>
   </w:num>
-  <w:num w:numId="5" w16cid:durableId="2087264557">
-    <w:abstractNumId w:val="6"/>
-  </w:num>
-  <w:num w:numId="6" w16cid:durableId="2016106074">
+  <w:num w:numId="7" w16cid:durableId="563370010">
     <w:abstractNumId w:val="4"/>
-  </w:num>
-  <w:num w:numId="7" w16cid:durableId="563370010">
-    <w:abstractNumId w:val="3"/>
   </w:num>
   <w:num w:numId="8" w16cid:durableId="375547179">
     <w:abstractNumId w:val="0"/>
+  </w:num>
+  <w:num w:numId="9" w16cid:durableId="358436021">
+    <w:abstractNumId w:val="1"/>
+  </w:num>
+  <w:num w:numId="10" w16cid:durableId="1293097454">
+    <w:abstractNumId w:val="6"/>
   </w:num>
 </w:numbering>
 </file>
@@ -3449,6 +5067,7 @@
   <w:style w:type="character" w:default="1" w:styleId="DefaultParagraphFont">
     <w:name w:val="Default Paragraph Font"/>
     <w:uiPriority w:val="1"/>
+    <w:semiHidden/>
     <w:unhideWhenUsed/>
   </w:style>
   <w:style w:type="table" w:default="1" w:styleId="TableNormal">

</xml_diff>